<commit_message>
Quiz tick boxes, quiz BA and updated Cherry guide
Observer Quiz now has Word tick boxes for the choice and True/False answers; new Cherry_Wilkes_Observer_Quiz_BA.docx (Benchmark Answers for marking); teacher guide covers the name box, quiz numbers, the two session downloads and the BA. Hints regenerated (same content).

Co-Authored-By: Claude Opus 5.5 <noreply@anthropic.com>
</commit_message>
<xml_diff>
--- a/docs/Cherry_Wilkes_Observer_Quiz.docx
+++ b/docs/Cherry_Wilkes_Observer_Quiz.docx
@@ -141,61 +141,136 @@
         <w:rPr>
           <w:rFonts w:ascii="Calibri" w:hAnsi="Calibri" w:cs="Calibri"/>
         </w:rPr>
-        <w:t>Checklist point: Reassure her, and use touch the way she likes it. Circle a, b or c.</w:t>
-      </w:r>
-    </w:p>
-    <w:p>
-      <w:pPr>
-        <w:pStyle w:val="opt"/>
-        <w:rPr>
-          <w:rFonts w:ascii="Calibri" w:hAnsi="Calibri" w:cs="Calibri"/>
-          <w:sz w:val="22"/>
-          <w:szCs w:val="22"/>
-        </w:rPr>
-      </w:pPr>
-      <w:r>
-        <w:rPr>
-          <w:rFonts w:ascii="Calibri" w:hAnsi="Calibri" w:cs="Calibri"/>
-          <w:sz w:val="22"/>
-          <w:szCs w:val="22"/>
-        </w:rPr>
-        <w:t>a) a big hug</w:t>
-      </w:r>
-    </w:p>
-    <w:p>
-      <w:pPr>
-        <w:pStyle w:val="opt"/>
-        <w:rPr>
-          <w:rFonts w:ascii="Calibri" w:hAnsi="Calibri" w:cs="Calibri"/>
-          <w:sz w:val="22"/>
-          <w:szCs w:val="22"/>
-        </w:rPr>
-      </w:pPr>
-      <w:r>
-        <w:rPr>
-          <w:rFonts w:ascii="Calibri" w:hAnsi="Calibri" w:cs="Calibri"/>
-          <w:sz w:val="22"/>
-          <w:szCs w:val="22"/>
-        </w:rPr>
-        <w:t>b) someone holding her hand, if they ask first</w:t>
-      </w:r>
-    </w:p>
-    <w:p>
-      <w:pPr>
-        <w:pStyle w:val="opt"/>
-        <w:rPr>
-          <w:rFonts w:ascii="Calibri" w:hAnsi="Calibri" w:cs="Calibri"/>
-          <w:sz w:val="22"/>
-          <w:szCs w:val="22"/>
-        </w:rPr>
-      </w:pPr>
-      <w:r>
-        <w:rPr>
-          <w:rFonts w:ascii="Calibri" w:hAnsi="Calibri" w:cs="Calibri"/>
-          <w:sz w:val="22"/>
-          <w:szCs w:val="22"/>
-        </w:rPr>
-        <w:t>c) being left alone</w:t>
+        <w:t>Checklist point: Reassure her, and use touch the way she likes it. Tick one box.</w:t>
+      </w:r>
+    </w:p>
+    <w:p>
+      <w:pPr>
+        <w:pStyle w:val="opt"/>
+        <w:rPr>
+          <w:rFonts w:ascii="Calibri" w:hAnsi="Calibri" w:cs="Calibri"/>
+          <w:sz w:val="22"/>
+          <w:szCs w:val="22"/>
+        </w:rPr>
+      </w:pPr>
+      <w:sdt>
+        <w:sdtPr>
+          <w:rPr>
+            <w:rFonts w:ascii="Calibri" w:hAnsi="Calibri" w:cs="Calibri"/>
+            <w:sz w:val="22"/>
+            <w:szCs w:val="22"/>
+          </w:rPr>
+          <w:id w:val="-1679489900"/>
+          <w14:checkbox>
+            <w14:checked w14:val="0"/>
+            <w14:checkedState w14:val="2612" w14:font="MS Gothic"/>
+            <w14:uncheckedState w14:val="2610" w14:font="MS Gothic"/>
+          </w14:checkbox>
+        </w:sdtPr>
+        <w:sdtContent>
+          <w:r>
+            <w:rPr>
+              <w:rFonts w:ascii="MS Gothic" w:eastAsia="MS Gothic" w:hAnsi="MS Gothic" w:cs="Calibri" w:hint="eastAsia"/>
+              <w:sz w:val="22"/>
+              <w:szCs w:val="22"/>
+            </w:rPr>
+            <w:t>☐</w:t>
+          </w:r>
+        </w:sdtContent>
+      </w:sdt>
+      <w:r>
+        <w:rPr>
+          <w:rFonts w:ascii="Calibri" w:hAnsi="Calibri" w:cs="Calibri"/>
+          <w:sz w:val="22"/>
+          <w:szCs w:val="22"/>
+        </w:rPr>
+        <w:t>  a) a big hug</w:t>
+      </w:r>
+    </w:p>
+    <w:p>
+      <w:pPr>
+        <w:pStyle w:val="opt"/>
+        <w:rPr>
+          <w:rFonts w:ascii="Calibri" w:hAnsi="Calibri" w:cs="Calibri"/>
+          <w:sz w:val="22"/>
+          <w:szCs w:val="22"/>
+        </w:rPr>
+      </w:pPr>
+      <w:sdt>
+        <w:sdtPr>
+          <w:rPr>
+            <w:rFonts w:ascii="Calibri" w:hAnsi="Calibri" w:cs="Calibri"/>
+            <w:sz w:val="22"/>
+            <w:szCs w:val="22"/>
+          </w:rPr>
+          <w:id w:val="910349050"/>
+          <w14:checkbox>
+            <w14:checked w14:val="0"/>
+            <w14:checkedState w14:val="2612" w14:font="MS Gothic"/>
+            <w14:uncheckedState w14:val="2610" w14:font="MS Gothic"/>
+          </w14:checkbox>
+        </w:sdtPr>
+        <w:sdtContent>
+          <w:r>
+            <w:rPr>
+              <w:rFonts w:ascii="MS Gothic" w:eastAsia="MS Gothic" w:hAnsi="MS Gothic" w:cs="Calibri" w:hint="eastAsia"/>
+              <w:sz w:val="22"/>
+              <w:szCs w:val="22"/>
+            </w:rPr>
+            <w:t>☐</w:t>
+          </w:r>
+        </w:sdtContent>
+      </w:sdt>
+      <w:r>
+        <w:rPr>
+          <w:rFonts w:ascii="Calibri" w:hAnsi="Calibri" w:cs="Calibri"/>
+          <w:sz w:val="22"/>
+          <w:szCs w:val="22"/>
+        </w:rPr>
+        <w:t>  b) someone holding her hand, if they ask first</w:t>
+      </w:r>
+    </w:p>
+    <w:p>
+      <w:pPr>
+        <w:pStyle w:val="opt"/>
+        <w:rPr>
+          <w:rFonts w:ascii="Calibri" w:hAnsi="Calibri" w:cs="Calibri"/>
+          <w:sz w:val="22"/>
+          <w:szCs w:val="22"/>
+        </w:rPr>
+      </w:pPr>
+      <w:sdt>
+        <w:sdtPr>
+          <w:rPr>
+            <w:rFonts w:ascii="Calibri" w:hAnsi="Calibri" w:cs="Calibri"/>
+            <w:sz w:val="22"/>
+            <w:szCs w:val="22"/>
+          </w:rPr>
+          <w:id w:val="129286485"/>
+          <w14:checkbox>
+            <w14:checked w14:val="0"/>
+            <w14:checkedState w14:val="2612" w14:font="MS Gothic"/>
+            <w14:uncheckedState w14:val="2610" w14:font="MS Gothic"/>
+          </w14:checkbox>
+        </w:sdtPr>
+        <w:sdtContent>
+          <w:r>
+            <w:rPr>
+              <w:rFonts w:ascii="MS Gothic" w:eastAsia="MS Gothic" w:hAnsi="MS Gothic" w:cs="Calibri" w:hint="eastAsia"/>
+              <w:sz w:val="22"/>
+              <w:szCs w:val="22"/>
+            </w:rPr>
+            <w:t>☐</w:t>
+          </w:r>
+        </w:sdtContent>
+      </w:sdt>
+      <w:r>
+        <w:rPr>
+          <w:rFonts w:ascii="Calibri" w:hAnsi="Calibri" w:cs="Calibri"/>
+          <w:sz w:val="22"/>
+          <w:szCs w:val="22"/>
+        </w:rPr>
+        <w:t>  c) being left alone</w:t>
       </w:r>
     </w:p>
     <w:p>
@@ -229,25 +304,83 @@
         <w:rPr>
           <w:rFonts w:ascii="Calibri" w:hAnsi="Calibri" w:cs="Calibri"/>
         </w:rPr>
-        <w:t>Checklist point: Build her self-esteem and confidence. Circle True or False.</w:t>
-      </w:r>
-    </w:p>
-    <w:p>
-      <w:pPr>
-        <w:pStyle w:val="opt"/>
-        <w:rPr>
-          <w:rFonts w:ascii="Calibri" w:hAnsi="Calibri" w:cs="Calibri"/>
-          <w:sz w:val="22"/>
-          <w:szCs w:val="22"/>
-        </w:rPr>
-      </w:pPr>
-      <w:r>
-        <w:rPr>
-          <w:rFonts w:ascii="Calibri" w:hAnsi="Calibri" w:cs="Calibri"/>
-          <w:sz w:val="22"/>
-          <w:szCs w:val="22"/>
-        </w:rPr>
-        <w:t>True   /   False</w:t>
+        <w:t>Checklist point: Build her self-esteem and confidence. Tick True or False.</w:t>
+      </w:r>
+    </w:p>
+    <w:p>
+      <w:pPr>
+        <w:pStyle w:val="opt"/>
+        <w:rPr>
+          <w:rFonts w:ascii="Calibri" w:hAnsi="Calibri" w:cs="Calibri"/>
+          <w:sz w:val="22"/>
+          <w:szCs w:val="22"/>
+        </w:rPr>
+      </w:pPr>
+      <w:sdt>
+        <w:sdtPr>
+          <w:rPr>
+            <w:rFonts w:ascii="Calibri" w:hAnsi="Calibri" w:cs="Calibri"/>
+            <w:sz w:val="22"/>
+            <w:szCs w:val="22"/>
+          </w:rPr>
+          <w:id w:val="1449503805"/>
+          <w14:checkbox>
+            <w14:checked w14:val="0"/>
+            <w14:checkedState w14:val="2612" w14:font="MS Gothic"/>
+            <w14:uncheckedState w14:val="2610" w14:font="MS Gothic"/>
+          </w14:checkbox>
+        </w:sdtPr>
+        <w:sdtContent>
+          <w:r>
+            <w:rPr>
+              <w:rFonts w:ascii="MS Gothic" w:eastAsia="MS Gothic" w:hAnsi="MS Gothic" w:cs="Calibri" w:hint="eastAsia"/>
+              <w:sz w:val="22"/>
+              <w:szCs w:val="22"/>
+            </w:rPr>
+            <w:t>☐</w:t>
+          </w:r>
+        </w:sdtContent>
+      </w:sdt>
+      <w:r>
+        <w:rPr>
+          <w:rFonts w:ascii="Calibri" w:hAnsi="Calibri" w:cs="Calibri"/>
+          <w:sz w:val="22"/>
+          <w:szCs w:val="22"/>
+        </w:rPr>
+        <w:t>  True       </w:t>
+      </w:r>
+      <w:sdt>
+        <w:sdtPr>
+          <w:rPr>
+            <w:rFonts w:ascii="Calibri" w:hAnsi="Calibri" w:cs="Calibri"/>
+            <w:sz w:val="22"/>
+            <w:szCs w:val="22"/>
+          </w:rPr>
+          <w:id w:val="1361472241"/>
+          <w14:checkbox>
+            <w14:checked w14:val="0"/>
+            <w14:checkedState w14:val="2612" w14:font="MS Gothic"/>
+            <w14:uncheckedState w14:val="2610" w14:font="MS Gothic"/>
+          </w14:checkbox>
+        </w:sdtPr>
+        <w:sdtContent>
+          <w:r>
+            <w:rPr>
+              <w:rFonts w:ascii="MS Gothic" w:eastAsia="MS Gothic" w:hAnsi="MS Gothic" w:cs="Calibri" w:hint="eastAsia"/>
+              <w:sz w:val="22"/>
+              <w:szCs w:val="22"/>
+            </w:rPr>
+            <w:t>☐</w:t>
+          </w:r>
+        </w:sdtContent>
+      </w:sdt>
+      <w:r>
+        <w:rPr>
+          <w:rFonts w:ascii="Calibri" w:hAnsi="Calibri" w:cs="Calibri"/>
+          <w:sz w:val="22"/>
+          <w:szCs w:val="22"/>
+        </w:rPr>
+        <w:t>  False</w:t>
       </w:r>
     </w:p>
     <w:p>
@@ -281,69 +414,136 @@
         <w:rPr>
           <w:rFonts w:ascii="Calibri" w:hAnsi="Calibri" w:cs="Calibri"/>
         </w:rPr>
-        <w:t>Checklist point: Show empathy, no judging. Circle a, b or c.</w:t>
-      </w:r>
-    </w:p>
-    <w:p>
-      <w:pPr>
-        <w:pStyle w:val="opt"/>
-        <w:rPr>
-          <w:rFonts w:ascii="Calibri" w:hAnsi="Calibri" w:cs="Calibri"/>
-          <w:sz w:val="22"/>
-          <w:szCs w:val="22"/>
-        </w:rPr>
-      </w:pPr>
-      <w:r>
-        <w:rPr>
-          <w:rFonts w:ascii="Calibri" w:hAnsi="Calibri" w:cs="Calibri"/>
-          <w:sz w:val="22"/>
-          <w:szCs w:val="22"/>
-        </w:rPr>
-        <w:t>a) "It'</w:t>
-      </w:r>
-      <w:r>
-        <w:rPr>
-          <w:rFonts w:ascii="Calibri" w:hAnsi="Calibri" w:cs="Calibri"/>
-          <w:sz w:val="22"/>
-          <w:szCs w:val="22"/>
-        </w:rPr>
-        <w:t>s only an ornament."</w:t>
-      </w:r>
-    </w:p>
-    <w:p>
-      <w:pPr>
-        <w:pStyle w:val="opt"/>
-        <w:rPr>
-          <w:rFonts w:ascii="Calibri" w:hAnsi="Calibri" w:cs="Calibri"/>
-          <w:sz w:val="22"/>
-          <w:szCs w:val="22"/>
-        </w:rPr>
-      </w:pPr>
-      <w:r>
-        <w:rPr>
-          <w:rFonts w:ascii="Calibri" w:hAnsi="Calibri" w:cs="Calibri"/>
-          <w:sz w:val="22"/>
-          <w:szCs w:val="22"/>
-        </w:rPr>
-        <w:t>b) "That sounds really hard. It meant a lot to you."</w:t>
-      </w:r>
-    </w:p>
-    <w:p>
-      <w:pPr>
-        <w:pStyle w:val="opt"/>
-        <w:rPr>
-          <w:rFonts w:ascii="Calibri" w:hAnsi="Calibri" w:cs="Calibri"/>
-          <w:sz w:val="22"/>
-          <w:szCs w:val="22"/>
-        </w:rPr>
-      </w:pPr>
-      <w:r>
-        <w:rPr>
-          <w:rFonts w:ascii="Calibri" w:hAnsi="Calibri" w:cs="Calibri"/>
-          <w:sz w:val="22"/>
-          <w:szCs w:val="22"/>
-        </w:rPr>
-        <w:t>c) "Calm down, please."</w:t>
+        <w:t>Checklist point: Show empathy, no judging. Tick one box.</w:t>
+      </w:r>
+    </w:p>
+    <w:p>
+      <w:pPr>
+        <w:pStyle w:val="opt"/>
+        <w:rPr>
+          <w:rFonts w:ascii="Calibri" w:hAnsi="Calibri" w:cs="Calibri"/>
+          <w:sz w:val="22"/>
+          <w:szCs w:val="22"/>
+        </w:rPr>
+      </w:pPr>
+      <w:sdt>
+        <w:sdtPr>
+          <w:rPr>
+            <w:rFonts w:ascii="Calibri" w:hAnsi="Calibri" w:cs="Calibri"/>
+            <w:sz w:val="22"/>
+            <w:szCs w:val="22"/>
+          </w:rPr>
+          <w:id w:val="-871218527"/>
+          <w14:checkbox>
+            <w14:checked w14:val="0"/>
+            <w14:checkedState w14:val="2612" w14:font="MS Gothic"/>
+            <w14:uncheckedState w14:val="2610" w14:font="MS Gothic"/>
+          </w14:checkbox>
+        </w:sdtPr>
+        <w:sdtContent>
+          <w:r>
+            <w:rPr>
+              <w:rFonts w:ascii="MS Gothic" w:eastAsia="MS Gothic" w:hAnsi="MS Gothic" w:cs="Calibri" w:hint="eastAsia"/>
+              <w:sz w:val="22"/>
+              <w:szCs w:val="22"/>
+            </w:rPr>
+            <w:t>☐</w:t>
+          </w:r>
+        </w:sdtContent>
+      </w:sdt>
+      <w:r>
+        <w:rPr>
+          <w:rFonts w:ascii="Calibri" w:hAnsi="Calibri" w:cs="Calibri"/>
+          <w:sz w:val="22"/>
+          <w:szCs w:val="22"/>
+        </w:rPr>
+        <w:t>  a) "It's only an ornament."</w:t>
+      </w:r>
+    </w:p>
+    <w:p>
+      <w:pPr>
+        <w:pStyle w:val="opt"/>
+        <w:rPr>
+          <w:rFonts w:ascii="Calibri" w:hAnsi="Calibri" w:cs="Calibri"/>
+          <w:sz w:val="22"/>
+          <w:szCs w:val="22"/>
+        </w:rPr>
+      </w:pPr>
+      <w:sdt>
+        <w:sdtPr>
+          <w:rPr>
+            <w:rFonts w:ascii="Calibri" w:hAnsi="Calibri" w:cs="Calibri"/>
+            <w:sz w:val="22"/>
+            <w:szCs w:val="22"/>
+          </w:rPr>
+          <w:id w:val="954292302"/>
+          <w14:checkbox>
+            <w14:checked w14:val="0"/>
+            <w14:checkedState w14:val="2612" w14:font="MS Gothic"/>
+            <w14:uncheckedState w14:val="2610" w14:font="MS Gothic"/>
+          </w14:checkbox>
+        </w:sdtPr>
+        <w:sdtContent>
+          <w:r>
+            <w:rPr>
+              <w:rFonts w:ascii="MS Gothic" w:eastAsia="MS Gothic" w:hAnsi="MS Gothic" w:cs="Calibri" w:hint="eastAsia"/>
+              <w:sz w:val="22"/>
+              <w:szCs w:val="22"/>
+            </w:rPr>
+            <w:t>☐</w:t>
+          </w:r>
+        </w:sdtContent>
+      </w:sdt>
+      <w:r>
+        <w:rPr>
+          <w:rFonts w:ascii="Calibri" w:hAnsi="Calibri" w:cs="Calibri"/>
+          <w:sz w:val="22"/>
+          <w:szCs w:val="22"/>
+        </w:rPr>
+        <w:t>  b) "That sounds really hard. It meant a lot to you."</w:t>
+      </w:r>
+    </w:p>
+    <w:p>
+      <w:pPr>
+        <w:pStyle w:val="opt"/>
+        <w:rPr>
+          <w:rFonts w:ascii="Calibri" w:hAnsi="Calibri" w:cs="Calibri"/>
+          <w:sz w:val="22"/>
+          <w:szCs w:val="22"/>
+        </w:rPr>
+      </w:pPr>
+      <w:sdt>
+        <w:sdtPr>
+          <w:rPr>
+            <w:rFonts w:ascii="Calibri" w:hAnsi="Calibri" w:cs="Calibri"/>
+            <w:sz w:val="22"/>
+            <w:szCs w:val="22"/>
+          </w:rPr>
+          <w:id w:val="1720626862"/>
+          <w14:checkbox>
+            <w14:checked w14:val="0"/>
+            <w14:checkedState w14:val="2612" w14:font="MS Gothic"/>
+            <w14:uncheckedState w14:val="2610" w14:font="MS Gothic"/>
+          </w14:checkbox>
+        </w:sdtPr>
+        <w:sdtContent>
+          <w:r>
+            <w:rPr>
+              <w:rFonts w:ascii="MS Gothic" w:eastAsia="MS Gothic" w:hAnsi="MS Gothic" w:cs="Calibri" w:hint="eastAsia"/>
+              <w:sz w:val="22"/>
+              <w:szCs w:val="22"/>
+            </w:rPr>
+            <w:t>☐</w:t>
+          </w:r>
+        </w:sdtContent>
+      </w:sdt>
+      <w:r>
+        <w:rPr>
+          <w:rFonts w:ascii="Calibri" w:hAnsi="Calibri" w:cs="Calibri"/>
+          <w:sz w:val="22"/>
+          <w:szCs w:val="22"/>
+        </w:rPr>
+        <w:t>  c) "Calm down, please."</w:t>
       </w:r>
     </w:p>
     <w:p>
@@ -470,15 +670,7 @@
           <w:sz w:val="22"/>
           <w:szCs w:val="22"/>
         </w:rPr>
-        <w:t>Social: Cherry'</w:t>
-      </w:r>
-      <w:r>
-        <w:rPr>
-          <w:rFonts w:ascii="Calibri" w:hAnsi="Calibri" w:cs="Calibri"/>
-          <w:sz w:val="22"/>
-          <w:szCs w:val="22"/>
-        </w:rPr>
-        <w:t>s friend from the church choir is called ________.</w:t>
+        <w:t>Social: Cherry's friend from the church choir is called ________.</w:t>
       </w:r>
     </w:p>
     <w:p>
@@ -571,25 +763,83 @@
         <w:rPr>
           <w:rFonts w:ascii="Calibri" w:hAnsi="Calibri" w:cs="Calibri"/>
         </w:rPr>
-        <w:t>Checklist point: Respects her social, cultural and spiritual wishes. Circle True or False.</w:t>
-      </w:r>
-    </w:p>
-    <w:p>
-      <w:pPr>
-        <w:pStyle w:val="opt"/>
-        <w:rPr>
-          <w:rFonts w:ascii="Calibri" w:hAnsi="Calibri" w:cs="Calibri"/>
-          <w:sz w:val="22"/>
-          <w:szCs w:val="22"/>
-        </w:rPr>
-      </w:pPr>
-      <w:r>
-        <w:rPr>
-          <w:rFonts w:ascii="Calibri" w:hAnsi="Calibri" w:cs="Calibri"/>
-          <w:sz w:val="22"/>
-          <w:szCs w:val="22"/>
-        </w:rPr>
-        <w:t>True   /   False</w:t>
+        <w:t>Checklist point: Respects her social, cultural and spiritual wishes. Tick True or False.</w:t>
+      </w:r>
+    </w:p>
+    <w:p>
+      <w:pPr>
+        <w:pStyle w:val="opt"/>
+        <w:rPr>
+          <w:rFonts w:ascii="Calibri" w:hAnsi="Calibri" w:cs="Calibri"/>
+          <w:sz w:val="22"/>
+          <w:szCs w:val="22"/>
+        </w:rPr>
+      </w:pPr>
+      <w:sdt>
+        <w:sdtPr>
+          <w:rPr>
+            <w:rFonts w:ascii="Calibri" w:hAnsi="Calibri" w:cs="Calibri"/>
+            <w:sz w:val="22"/>
+            <w:szCs w:val="22"/>
+          </w:rPr>
+          <w:id w:val="2086328169"/>
+          <w14:checkbox>
+            <w14:checked w14:val="0"/>
+            <w14:checkedState w14:val="2612" w14:font="MS Gothic"/>
+            <w14:uncheckedState w14:val="2610" w14:font="MS Gothic"/>
+          </w14:checkbox>
+        </w:sdtPr>
+        <w:sdtContent>
+          <w:r>
+            <w:rPr>
+              <w:rFonts w:ascii="MS Gothic" w:eastAsia="MS Gothic" w:hAnsi="MS Gothic" w:cs="Calibri" w:hint="eastAsia"/>
+              <w:sz w:val="22"/>
+              <w:szCs w:val="22"/>
+            </w:rPr>
+            <w:t>☐</w:t>
+          </w:r>
+        </w:sdtContent>
+      </w:sdt>
+      <w:r>
+        <w:rPr>
+          <w:rFonts w:ascii="Calibri" w:hAnsi="Calibri" w:cs="Calibri"/>
+          <w:sz w:val="22"/>
+          <w:szCs w:val="22"/>
+        </w:rPr>
+        <w:t>  True       </w:t>
+      </w:r>
+      <w:sdt>
+        <w:sdtPr>
+          <w:rPr>
+            <w:rFonts w:ascii="Calibri" w:hAnsi="Calibri" w:cs="Calibri"/>
+            <w:sz w:val="22"/>
+            <w:szCs w:val="22"/>
+          </w:rPr>
+          <w:id w:val="-1542897142"/>
+          <w14:checkbox>
+            <w14:checked w14:val="0"/>
+            <w14:checkedState w14:val="2612" w14:font="MS Gothic"/>
+            <w14:uncheckedState w14:val="2610" w14:font="MS Gothic"/>
+          </w14:checkbox>
+        </w:sdtPr>
+        <w:sdtContent>
+          <w:r>
+            <w:rPr>
+              <w:rFonts w:ascii="MS Gothic" w:eastAsia="MS Gothic" w:hAnsi="MS Gothic" w:cs="Calibri" w:hint="eastAsia"/>
+              <w:sz w:val="22"/>
+              <w:szCs w:val="22"/>
+            </w:rPr>
+            <w:t>☐</w:t>
+          </w:r>
+        </w:sdtContent>
+      </w:sdt>
+      <w:r>
+        <w:rPr>
+          <w:rFonts w:ascii="Calibri" w:hAnsi="Calibri" w:cs="Calibri"/>
+          <w:sz w:val="22"/>
+          <w:szCs w:val="22"/>
+        </w:rPr>
+        <w:t>  False</w:t>
       </w:r>
     </w:p>
     <w:p>
@@ -624,61 +874,136 @@
           <w:rFonts w:ascii="Calibri" w:hAnsi="Calibri" w:cs="Calibri"/>
         </w:rPr>
         <w:lastRenderedPageBreak/>
-        <w:t>Checklist point: Thinks about her needs, stage of life and strengths. Circle a, b or c.</w:t>
-      </w:r>
-    </w:p>
-    <w:p>
-      <w:pPr>
-        <w:pStyle w:val="opt"/>
-        <w:rPr>
-          <w:rFonts w:ascii="Calibri" w:hAnsi="Calibri" w:cs="Calibri"/>
-          <w:sz w:val="22"/>
-          <w:szCs w:val="22"/>
-        </w:rPr>
-      </w:pPr>
-      <w:r>
-        <w:rPr>
-          <w:rFonts w:ascii="Calibri" w:hAnsi="Calibri" w:cs="Calibri"/>
-          <w:sz w:val="22"/>
-          <w:szCs w:val="22"/>
-        </w:rPr>
-        <w:t>a) Tell her to try harder.</w:t>
-      </w:r>
-    </w:p>
-    <w:p>
-      <w:pPr>
-        <w:pStyle w:val="opt"/>
-        <w:rPr>
-          <w:rFonts w:ascii="Calibri" w:hAnsi="Calibri" w:cs="Calibri"/>
-          <w:sz w:val="22"/>
-          <w:szCs w:val="22"/>
-        </w:rPr>
-      </w:pPr>
-      <w:r>
-        <w:rPr>
-          <w:rFonts w:ascii="Calibri" w:hAnsi="Calibri" w:cs="Calibri"/>
-          <w:sz w:val="22"/>
-          <w:szCs w:val="22"/>
-        </w:rPr>
-        <w:t>b) Offer to press the phone buttons while she talks.</w:t>
-      </w:r>
-    </w:p>
-    <w:p>
-      <w:pPr>
-        <w:pStyle w:val="opt"/>
-        <w:rPr>
-          <w:rFonts w:ascii="Calibri" w:hAnsi="Calibri" w:cs="Calibri"/>
-          <w:sz w:val="22"/>
-          <w:szCs w:val="22"/>
-        </w:rPr>
-      </w:pPr>
-      <w:r>
-        <w:rPr>
-          <w:rFonts w:ascii="Calibri" w:hAnsi="Calibri" w:cs="Calibri"/>
-          <w:sz w:val="22"/>
-          <w:szCs w:val="22"/>
-        </w:rPr>
-        <w:t>c) Take her phone away.</w:t>
+        <w:t>Checklist point: Thinks about her needs, stage of life and strengths. Tick one box.</w:t>
+      </w:r>
+    </w:p>
+    <w:p>
+      <w:pPr>
+        <w:pStyle w:val="opt"/>
+        <w:rPr>
+          <w:rFonts w:ascii="Calibri" w:hAnsi="Calibri" w:cs="Calibri"/>
+          <w:sz w:val="22"/>
+          <w:szCs w:val="22"/>
+        </w:rPr>
+      </w:pPr>
+      <w:sdt>
+        <w:sdtPr>
+          <w:rPr>
+            <w:rFonts w:ascii="Calibri" w:hAnsi="Calibri" w:cs="Calibri"/>
+            <w:sz w:val="22"/>
+            <w:szCs w:val="22"/>
+          </w:rPr>
+          <w:id w:val="211163004"/>
+          <w14:checkbox>
+            <w14:checked w14:val="0"/>
+            <w14:checkedState w14:val="2612" w14:font="MS Gothic"/>
+            <w14:uncheckedState w14:val="2610" w14:font="MS Gothic"/>
+          </w14:checkbox>
+        </w:sdtPr>
+        <w:sdtContent>
+          <w:r>
+            <w:rPr>
+              <w:rFonts w:ascii="MS Gothic" w:eastAsia="MS Gothic" w:hAnsi="MS Gothic" w:cs="Calibri" w:hint="eastAsia"/>
+              <w:sz w:val="22"/>
+              <w:szCs w:val="22"/>
+            </w:rPr>
+            <w:t>☐</w:t>
+          </w:r>
+        </w:sdtContent>
+      </w:sdt>
+      <w:r>
+        <w:rPr>
+          <w:rFonts w:ascii="Calibri" w:hAnsi="Calibri" w:cs="Calibri"/>
+          <w:sz w:val="22"/>
+          <w:szCs w:val="22"/>
+        </w:rPr>
+        <w:t>  a) Tell her to try harder.</w:t>
+      </w:r>
+    </w:p>
+    <w:p>
+      <w:pPr>
+        <w:pStyle w:val="opt"/>
+        <w:rPr>
+          <w:rFonts w:ascii="Calibri" w:hAnsi="Calibri" w:cs="Calibri"/>
+          <w:sz w:val="22"/>
+          <w:szCs w:val="22"/>
+        </w:rPr>
+      </w:pPr>
+      <w:sdt>
+        <w:sdtPr>
+          <w:rPr>
+            <w:rFonts w:ascii="Calibri" w:hAnsi="Calibri" w:cs="Calibri"/>
+            <w:sz w:val="22"/>
+            <w:szCs w:val="22"/>
+          </w:rPr>
+          <w:id w:val="1152871401"/>
+          <w14:checkbox>
+            <w14:checked w14:val="0"/>
+            <w14:checkedState w14:val="2612" w14:font="MS Gothic"/>
+            <w14:uncheckedState w14:val="2610" w14:font="MS Gothic"/>
+          </w14:checkbox>
+        </w:sdtPr>
+        <w:sdtContent>
+          <w:r>
+            <w:rPr>
+              <w:rFonts w:ascii="MS Gothic" w:eastAsia="MS Gothic" w:hAnsi="MS Gothic" w:cs="Calibri" w:hint="eastAsia"/>
+              <w:sz w:val="22"/>
+              <w:szCs w:val="22"/>
+            </w:rPr>
+            <w:t>☐</w:t>
+          </w:r>
+        </w:sdtContent>
+      </w:sdt>
+      <w:r>
+        <w:rPr>
+          <w:rFonts w:ascii="Calibri" w:hAnsi="Calibri" w:cs="Calibri"/>
+          <w:sz w:val="22"/>
+          <w:szCs w:val="22"/>
+        </w:rPr>
+        <w:t>  b) Offer to press the phone buttons while she talks.</w:t>
+      </w:r>
+    </w:p>
+    <w:p>
+      <w:pPr>
+        <w:pStyle w:val="opt"/>
+        <w:rPr>
+          <w:rFonts w:ascii="Calibri" w:hAnsi="Calibri" w:cs="Calibri"/>
+          <w:sz w:val="22"/>
+          <w:szCs w:val="22"/>
+        </w:rPr>
+      </w:pPr>
+      <w:sdt>
+        <w:sdtPr>
+          <w:rPr>
+            <w:rFonts w:ascii="Calibri" w:hAnsi="Calibri" w:cs="Calibri"/>
+            <w:sz w:val="22"/>
+            <w:szCs w:val="22"/>
+          </w:rPr>
+          <w:id w:val="1479811884"/>
+          <w14:checkbox>
+            <w14:checked w14:val="0"/>
+            <w14:checkedState w14:val="2612" w14:font="MS Gothic"/>
+            <w14:uncheckedState w14:val="2610" w14:font="MS Gothic"/>
+          </w14:checkbox>
+        </w:sdtPr>
+        <w:sdtContent>
+          <w:r>
+            <w:rPr>
+              <w:rFonts w:ascii="MS Gothic" w:eastAsia="MS Gothic" w:hAnsi="MS Gothic" w:cs="Calibri" w:hint="eastAsia"/>
+              <w:sz w:val="22"/>
+              <w:szCs w:val="22"/>
+            </w:rPr>
+            <w:t>☐</w:t>
+          </w:r>
+        </w:sdtContent>
+      </w:sdt>
+      <w:r>
+        <w:rPr>
+          <w:rFonts w:ascii="Calibri" w:hAnsi="Calibri" w:cs="Calibri"/>
+          <w:sz w:val="22"/>
+          <w:szCs w:val="22"/>
+        </w:rPr>
+        <w:t>  c) Take her phone away.</w:t>
       </w:r>
     </w:p>
     <w:p>
@@ -746,61 +1071,136 @@
         <w:rPr>
           <w:rFonts w:ascii="Calibri" w:hAnsi="Calibri" w:cs="Calibri"/>
         </w:rPr>
-        <w:t>Checklist point: Notices needs that are not being met. Circle a, b or c.</w:t>
-      </w:r>
-    </w:p>
-    <w:p>
-      <w:pPr>
-        <w:pStyle w:val="opt"/>
-        <w:rPr>
-          <w:rFonts w:ascii="Calibri" w:hAnsi="Calibri" w:cs="Calibri"/>
-          <w:sz w:val="22"/>
-          <w:szCs w:val="22"/>
-        </w:rPr>
-      </w:pPr>
-      <w:r>
-        <w:rPr>
-          <w:rFonts w:ascii="Calibri" w:hAnsi="Calibri" w:cs="Calibri"/>
-          <w:sz w:val="22"/>
-          <w:szCs w:val="22"/>
-        </w:rPr>
-        <w:t>a) Cherry has not eaten breakfast or slept.</w:t>
-      </w:r>
-    </w:p>
-    <w:p>
-      <w:pPr>
-        <w:pStyle w:val="opt"/>
-        <w:rPr>
-          <w:rFonts w:ascii="Calibri" w:hAnsi="Calibri" w:cs="Calibri"/>
-          <w:sz w:val="22"/>
-          <w:szCs w:val="22"/>
-        </w:rPr>
-      </w:pPr>
-      <w:r>
-        <w:rPr>
-          <w:rFonts w:ascii="Calibri" w:hAnsi="Calibri" w:cs="Calibri"/>
-          <w:sz w:val="22"/>
-          <w:szCs w:val="22"/>
-        </w:rPr>
-        <w:t>b) Cherry has no walking frame.</w:t>
-      </w:r>
-    </w:p>
-    <w:p>
-      <w:pPr>
-        <w:pStyle w:val="opt"/>
-        <w:rPr>
-          <w:rFonts w:ascii="Calibri" w:hAnsi="Calibri" w:cs="Calibri"/>
-          <w:sz w:val="22"/>
-          <w:szCs w:val="22"/>
-        </w:rPr>
-      </w:pPr>
-      <w:r>
-        <w:rPr>
-          <w:rFonts w:ascii="Calibri" w:hAnsi="Calibri" w:cs="Calibri"/>
-          <w:sz w:val="22"/>
-          <w:szCs w:val="22"/>
-        </w:rPr>
-        <w:t>c) Cherry has no phone.</w:t>
+        <w:t>Checklist point: Notices needs that are not being met. Tick one box.</w:t>
+      </w:r>
+    </w:p>
+    <w:p>
+      <w:pPr>
+        <w:pStyle w:val="opt"/>
+        <w:rPr>
+          <w:rFonts w:ascii="Calibri" w:hAnsi="Calibri" w:cs="Calibri"/>
+          <w:sz w:val="22"/>
+          <w:szCs w:val="22"/>
+        </w:rPr>
+      </w:pPr>
+      <w:sdt>
+        <w:sdtPr>
+          <w:rPr>
+            <w:rFonts w:ascii="Calibri" w:hAnsi="Calibri" w:cs="Calibri"/>
+            <w:sz w:val="22"/>
+            <w:szCs w:val="22"/>
+          </w:rPr>
+          <w:id w:val="-1206331647"/>
+          <w14:checkbox>
+            <w14:checked w14:val="0"/>
+            <w14:checkedState w14:val="2612" w14:font="MS Gothic"/>
+            <w14:uncheckedState w14:val="2610" w14:font="MS Gothic"/>
+          </w14:checkbox>
+        </w:sdtPr>
+        <w:sdtContent>
+          <w:r>
+            <w:rPr>
+              <w:rFonts w:ascii="MS Gothic" w:eastAsia="MS Gothic" w:hAnsi="MS Gothic" w:cs="Calibri" w:hint="eastAsia"/>
+              <w:sz w:val="22"/>
+              <w:szCs w:val="22"/>
+            </w:rPr>
+            <w:t>☐</w:t>
+          </w:r>
+        </w:sdtContent>
+      </w:sdt>
+      <w:r>
+        <w:rPr>
+          <w:rFonts w:ascii="Calibri" w:hAnsi="Calibri" w:cs="Calibri"/>
+          <w:sz w:val="22"/>
+          <w:szCs w:val="22"/>
+        </w:rPr>
+        <w:t>  a) Cherry has not eaten breakfast or slept.</w:t>
+      </w:r>
+    </w:p>
+    <w:p>
+      <w:pPr>
+        <w:pStyle w:val="opt"/>
+        <w:rPr>
+          <w:rFonts w:ascii="Calibri" w:hAnsi="Calibri" w:cs="Calibri"/>
+          <w:sz w:val="22"/>
+          <w:szCs w:val="22"/>
+        </w:rPr>
+      </w:pPr>
+      <w:sdt>
+        <w:sdtPr>
+          <w:rPr>
+            <w:rFonts w:ascii="Calibri" w:hAnsi="Calibri" w:cs="Calibri"/>
+            <w:sz w:val="22"/>
+            <w:szCs w:val="22"/>
+          </w:rPr>
+          <w:id w:val="40574032"/>
+          <w14:checkbox>
+            <w14:checked w14:val="0"/>
+            <w14:checkedState w14:val="2612" w14:font="MS Gothic"/>
+            <w14:uncheckedState w14:val="2610" w14:font="MS Gothic"/>
+          </w14:checkbox>
+        </w:sdtPr>
+        <w:sdtContent>
+          <w:r>
+            <w:rPr>
+              <w:rFonts w:ascii="MS Gothic" w:eastAsia="MS Gothic" w:hAnsi="MS Gothic" w:cs="Calibri" w:hint="eastAsia"/>
+              <w:sz w:val="22"/>
+              <w:szCs w:val="22"/>
+            </w:rPr>
+            <w:t>☐</w:t>
+          </w:r>
+        </w:sdtContent>
+      </w:sdt>
+      <w:r>
+        <w:rPr>
+          <w:rFonts w:ascii="Calibri" w:hAnsi="Calibri" w:cs="Calibri"/>
+          <w:sz w:val="22"/>
+          <w:szCs w:val="22"/>
+        </w:rPr>
+        <w:t>  b) Cherry has no walking frame.</w:t>
+      </w:r>
+    </w:p>
+    <w:p>
+      <w:pPr>
+        <w:pStyle w:val="opt"/>
+        <w:rPr>
+          <w:rFonts w:ascii="Calibri" w:hAnsi="Calibri" w:cs="Calibri"/>
+          <w:sz w:val="22"/>
+          <w:szCs w:val="22"/>
+        </w:rPr>
+      </w:pPr>
+      <w:sdt>
+        <w:sdtPr>
+          <w:rPr>
+            <w:rFonts w:ascii="Calibri" w:hAnsi="Calibri" w:cs="Calibri"/>
+            <w:sz w:val="22"/>
+            <w:szCs w:val="22"/>
+          </w:rPr>
+          <w:id w:val="-672252749"/>
+          <w14:checkbox>
+            <w14:checked w14:val="0"/>
+            <w14:checkedState w14:val="2612" w14:font="MS Gothic"/>
+            <w14:uncheckedState w14:val="2610" w14:font="MS Gothic"/>
+          </w14:checkbox>
+        </w:sdtPr>
+        <w:sdtContent>
+          <w:r>
+            <w:rPr>
+              <w:rFonts w:ascii="MS Gothic" w:eastAsia="MS Gothic" w:hAnsi="MS Gothic" w:cs="Calibri" w:hint="eastAsia"/>
+              <w:sz w:val="22"/>
+              <w:szCs w:val="22"/>
+            </w:rPr>
+            <w:t>☐</w:t>
+          </w:r>
+        </w:sdtContent>
+      </w:sdt>
+      <w:r>
+        <w:rPr>
+          <w:rFonts w:ascii="Calibri" w:hAnsi="Calibri" w:cs="Calibri"/>
+          <w:sz w:val="22"/>
+          <w:szCs w:val="22"/>
+        </w:rPr>
+        <w:t>  c) Cherry has no phone.</w:t>
       </w:r>
     </w:p>
     <w:p>
@@ -834,25 +1234,83 @@
         <w:rPr>
           <w:rFonts w:ascii="Calibri" w:hAnsi="Calibri" w:cs="Calibri"/>
         </w:rPr>
-        <w:t>Checklist point: Lets her make her own choices. Circle True or False.</w:t>
-      </w:r>
-    </w:p>
-    <w:p>
-      <w:pPr>
-        <w:pStyle w:val="opt"/>
-        <w:rPr>
-          <w:rFonts w:ascii="Calibri" w:hAnsi="Calibri" w:cs="Calibri"/>
-          <w:sz w:val="22"/>
-          <w:szCs w:val="22"/>
-        </w:rPr>
-      </w:pPr>
-      <w:r>
-        <w:rPr>
-          <w:rFonts w:ascii="Calibri" w:hAnsi="Calibri" w:cs="Calibri"/>
-          <w:sz w:val="22"/>
-          <w:szCs w:val="22"/>
-        </w:rPr>
-        <w:t>True   /   False</w:t>
+        <w:t>Checklist point: Lets her make her own choices. Tick True or False.</w:t>
+      </w:r>
+    </w:p>
+    <w:p>
+      <w:pPr>
+        <w:pStyle w:val="opt"/>
+        <w:rPr>
+          <w:rFonts w:ascii="Calibri" w:hAnsi="Calibri" w:cs="Calibri"/>
+          <w:sz w:val="22"/>
+          <w:szCs w:val="22"/>
+        </w:rPr>
+      </w:pPr>
+      <w:sdt>
+        <w:sdtPr>
+          <w:rPr>
+            <w:rFonts w:ascii="Calibri" w:hAnsi="Calibri" w:cs="Calibri"/>
+            <w:sz w:val="22"/>
+            <w:szCs w:val="22"/>
+          </w:rPr>
+          <w:id w:val="-28420663"/>
+          <w14:checkbox>
+            <w14:checked w14:val="0"/>
+            <w14:checkedState w14:val="2612" w14:font="MS Gothic"/>
+            <w14:uncheckedState w14:val="2610" w14:font="MS Gothic"/>
+          </w14:checkbox>
+        </w:sdtPr>
+        <w:sdtContent>
+          <w:r>
+            <w:rPr>
+              <w:rFonts w:ascii="MS Gothic" w:eastAsia="MS Gothic" w:hAnsi="MS Gothic" w:cs="Calibri" w:hint="eastAsia"/>
+              <w:sz w:val="22"/>
+              <w:szCs w:val="22"/>
+            </w:rPr>
+            <w:t>☐</w:t>
+          </w:r>
+        </w:sdtContent>
+      </w:sdt>
+      <w:r>
+        <w:rPr>
+          <w:rFonts w:ascii="Calibri" w:hAnsi="Calibri" w:cs="Calibri"/>
+          <w:sz w:val="22"/>
+          <w:szCs w:val="22"/>
+        </w:rPr>
+        <w:t>  True       </w:t>
+      </w:r>
+      <w:sdt>
+        <w:sdtPr>
+          <w:rPr>
+            <w:rFonts w:ascii="Calibri" w:hAnsi="Calibri" w:cs="Calibri"/>
+            <w:sz w:val="22"/>
+            <w:szCs w:val="22"/>
+          </w:rPr>
+          <w:id w:val="-1041436727"/>
+          <w14:checkbox>
+            <w14:checked w14:val="0"/>
+            <w14:checkedState w14:val="2612" w14:font="MS Gothic"/>
+            <w14:uncheckedState w14:val="2610" w14:font="MS Gothic"/>
+          </w14:checkbox>
+        </w:sdtPr>
+        <w:sdtContent>
+          <w:r>
+            <w:rPr>
+              <w:rFonts w:ascii="MS Gothic" w:eastAsia="MS Gothic" w:hAnsi="MS Gothic" w:cs="Calibri" w:hint="eastAsia"/>
+              <w:sz w:val="22"/>
+              <w:szCs w:val="22"/>
+            </w:rPr>
+            <w:t>☐</w:t>
+          </w:r>
+        </w:sdtContent>
+      </w:sdt>
+      <w:r>
+        <w:rPr>
+          <w:rFonts w:ascii="Calibri" w:hAnsi="Calibri" w:cs="Calibri"/>
+          <w:sz w:val="22"/>
+          <w:szCs w:val="22"/>
+        </w:rPr>
+        <w:t>  False</w:t>
       </w:r>
     </w:p>
     <w:p>
@@ -909,61 +1367,136 @@
         <w:rPr>
           <w:rFonts w:ascii="Calibri" w:hAnsi="Calibri" w:cs="Calibri"/>
         </w:rPr>
-        <w:t>Checklist point: Is person-centred, strengths-based and rights-based. Circle a, b or c.</w:t>
-      </w:r>
-    </w:p>
-    <w:p>
-      <w:pPr>
-        <w:pStyle w:val="opt"/>
-        <w:rPr>
-          <w:rFonts w:ascii="Calibri" w:hAnsi="Calibri" w:cs="Calibri"/>
-          <w:sz w:val="22"/>
-          <w:szCs w:val="22"/>
-        </w:rPr>
-      </w:pPr>
-      <w:r>
-        <w:rPr>
-          <w:rFonts w:ascii="Calibri" w:hAnsi="Calibri" w:cs="Calibri"/>
-          <w:sz w:val="22"/>
-          <w:szCs w:val="22"/>
-        </w:rPr>
-        <w:t>a) "I'll sort it all out for you."</w:t>
-      </w:r>
-    </w:p>
-    <w:p>
-      <w:pPr>
-        <w:pStyle w:val="opt"/>
-        <w:rPr>
-          <w:rFonts w:ascii="Calibri" w:hAnsi="Calibri" w:cs="Calibri"/>
-          <w:sz w:val="22"/>
-          <w:szCs w:val="22"/>
-        </w:rPr>
-      </w:pPr>
-      <w:r>
-        <w:rPr>
-          <w:rFonts w:ascii="Calibri" w:hAnsi="Calibri" w:cs="Calibri"/>
-          <w:sz w:val="22"/>
-          <w:szCs w:val="22"/>
-        </w:rPr>
-        <w:t>b) "What would you like to happen, Cherry?"</w:t>
-      </w:r>
-    </w:p>
-    <w:p>
-      <w:pPr>
-        <w:pStyle w:val="opt"/>
-        <w:rPr>
-          <w:rFonts w:ascii="Calibri" w:hAnsi="Calibri" w:cs="Calibri"/>
-          <w:sz w:val="22"/>
-          <w:szCs w:val="22"/>
-        </w:rPr>
-      </w:pPr>
-      <w:r>
-        <w:rPr>
-          <w:rFonts w:ascii="Calibri" w:hAnsi="Calibri" w:cs="Calibri"/>
-          <w:sz w:val="22"/>
-          <w:szCs w:val="22"/>
-        </w:rPr>
-        <w:t>c) "Your sister has to leave."</w:t>
+        <w:t>Checklist point: Is person-centred, strengths-based and rights-based. Tick one box.</w:t>
+      </w:r>
+    </w:p>
+    <w:p>
+      <w:pPr>
+        <w:pStyle w:val="opt"/>
+        <w:rPr>
+          <w:rFonts w:ascii="Calibri" w:hAnsi="Calibri" w:cs="Calibri"/>
+          <w:sz w:val="22"/>
+          <w:szCs w:val="22"/>
+        </w:rPr>
+      </w:pPr>
+      <w:sdt>
+        <w:sdtPr>
+          <w:rPr>
+            <w:rFonts w:ascii="Calibri" w:hAnsi="Calibri" w:cs="Calibri"/>
+            <w:sz w:val="22"/>
+            <w:szCs w:val="22"/>
+          </w:rPr>
+          <w:id w:val="1649941320"/>
+          <w14:checkbox>
+            <w14:checked w14:val="0"/>
+            <w14:checkedState w14:val="2612" w14:font="MS Gothic"/>
+            <w14:uncheckedState w14:val="2610" w14:font="MS Gothic"/>
+          </w14:checkbox>
+        </w:sdtPr>
+        <w:sdtContent>
+          <w:r>
+            <w:rPr>
+              <w:rFonts w:ascii="MS Gothic" w:eastAsia="MS Gothic" w:hAnsi="MS Gothic" w:cs="Calibri" w:hint="eastAsia"/>
+              <w:sz w:val="22"/>
+              <w:szCs w:val="22"/>
+            </w:rPr>
+            <w:t>☐</w:t>
+          </w:r>
+        </w:sdtContent>
+      </w:sdt>
+      <w:r>
+        <w:rPr>
+          <w:rFonts w:ascii="Calibri" w:hAnsi="Calibri" w:cs="Calibri"/>
+          <w:sz w:val="22"/>
+          <w:szCs w:val="22"/>
+        </w:rPr>
+        <w:t>  a) "I'll sort it all out for you."</w:t>
+      </w:r>
+    </w:p>
+    <w:p>
+      <w:pPr>
+        <w:pStyle w:val="opt"/>
+        <w:rPr>
+          <w:rFonts w:ascii="Calibri" w:hAnsi="Calibri" w:cs="Calibri"/>
+          <w:sz w:val="22"/>
+          <w:szCs w:val="22"/>
+        </w:rPr>
+      </w:pPr>
+      <w:sdt>
+        <w:sdtPr>
+          <w:rPr>
+            <w:rFonts w:ascii="Calibri" w:hAnsi="Calibri" w:cs="Calibri"/>
+            <w:sz w:val="22"/>
+            <w:szCs w:val="22"/>
+          </w:rPr>
+          <w:id w:val="-1187521628"/>
+          <w14:checkbox>
+            <w14:checked w14:val="0"/>
+            <w14:checkedState w14:val="2612" w14:font="MS Gothic"/>
+            <w14:uncheckedState w14:val="2610" w14:font="MS Gothic"/>
+          </w14:checkbox>
+        </w:sdtPr>
+        <w:sdtContent>
+          <w:r>
+            <w:rPr>
+              <w:rFonts w:ascii="MS Gothic" w:eastAsia="MS Gothic" w:hAnsi="MS Gothic" w:cs="Calibri" w:hint="eastAsia"/>
+              <w:sz w:val="22"/>
+              <w:szCs w:val="22"/>
+            </w:rPr>
+            <w:t>☐</w:t>
+          </w:r>
+        </w:sdtContent>
+      </w:sdt>
+      <w:r>
+        <w:rPr>
+          <w:rFonts w:ascii="Calibri" w:hAnsi="Calibri" w:cs="Calibri"/>
+          <w:sz w:val="22"/>
+          <w:szCs w:val="22"/>
+        </w:rPr>
+        <w:t>  b) "What would you like to happen, Cherry?"</w:t>
+      </w:r>
+    </w:p>
+    <w:p>
+      <w:pPr>
+        <w:pStyle w:val="opt"/>
+        <w:rPr>
+          <w:rFonts w:ascii="Calibri" w:hAnsi="Calibri" w:cs="Calibri"/>
+          <w:sz w:val="22"/>
+          <w:szCs w:val="22"/>
+        </w:rPr>
+      </w:pPr>
+      <w:sdt>
+        <w:sdtPr>
+          <w:rPr>
+            <w:rFonts w:ascii="Calibri" w:hAnsi="Calibri" w:cs="Calibri"/>
+            <w:sz w:val="22"/>
+            <w:szCs w:val="22"/>
+          </w:rPr>
+          <w:id w:val="478038466"/>
+          <w14:checkbox>
+            <w14:checked w14:val="0"/>
+            <w14:checkedState w14:val="2612" w14:font="MS Gothic"/>
+            <w14:uncheckedState w14:val="2610" w14:font="MS Gothic"/>
+          </w14:checkbox>
+        </w:sdtPr>
+        <w:sdtContent>
+          <w:r>
+            <w:rPr>
+              <w:rFonts w:ascii="MS Gothic" w:eastAsia="MS Gothic" w:hAnsi="MS Gothic" w:cs="Calibri" w:hint="eastAsia"/>
+              <w:sz w:val="22"/>
+              <w:szCs w:val="22"/>
+            </w:rPr>
+            <w:t>☐</w:t>
+          </w:r>
+        </w:sdtContent>
+      </w:sdt>
+      <w:r>
+        <w:rPr>
+          <w:rFonts w:ascii="Calibri" w:hAnsi="Calibri" w:cs="Calibri"/>
+          <w:sz w:val="22"/>
+          <w:szCs w:val="22"/>
+        </w:rPr>
+        <w:t>  c) "Your sister has to leave."</w:t>
       </w:r>
     </w:p>
     <w:p>
@@ -997,25 +1530,83 @@
         <w:rPr>
           <w:rFonts w:ascii="Calibri" w:hAnsi="Calibri" w:cs="Calibri"/>
         </w:rPr>
-        <w:t>Checklist point: Respects her right to take risks (dignity of risk). Circle True or False.</w:t>
-      </w:r>
-    </w:p>
-    <w:p>
-      <w:pPr>
-        <w:pStyle w:val="opt"/>
-        <w:rPr>
-          <w:rFonts w:ascii="Calibri" w:hAnsi="Calibri" w:cs="Calibri"/>
-          <w:sz w:val="22"/>
-          <w:szCs w:val="22"/>
-        </w:rPr>
-      </w:pPr>
-      <w:r>
-        <w:rPr>
-          <w:rFonts w:ascii="Calibri" w:hAnsi="Calibri" w:cs="Calibri"/>
-          <w:sz w:val="22"/>
-          <w:szCs w:val="22"/>
-        </w:rPr>
-        <w:t>True   /   False</w:t>
+        <w:t>Checklist point: Respects her right to take risks (dignity of risk). Tick True or False.</w:t>
+      </w:r>
+    </w:p>
+    <w:p>
+      <w:pPr>
+        <w:pStyle w:val="opt"/>
+        <w:rPr>
+          <w:rFonts w:ascii="Calibri" w:hAnsi="Calibri" w:cs="Calibri"/>
+          <w:sz w:val="22"/>
+          <w:szCs w:val="22"/>
+        </w:rPr>
+      </w:pPr>
+      <w:sdt>
+        <w:sdtPr>
+          <w:rPr>
+            <w:rFonts w:ascii="Calibri" w:hAnsi="Calibri" w:cs="Calibri"/>
+            <w:sz w:val="22"/>
+            <w:szCs w:val="22"/>
+          </w:rPr>
+          <w:id w:val="364177300"/>
+          <w14:checkbox>
+            <w14:checked w14:val="0"/>
+            <w14:checkedState w14:val="2612" w14:font="MS Gothic"/>
+            <w14:uncheckedState w14:val="2610" w14:font="MS Gothic"/>
+          </w14:checkbox>
+        </w:sdtPr>
+        <w:sdtContent>
+          <w:r>
+            <w:rPr>
+              <w:rFonts w:ascii="MS Gothic" w:eastAsia="MS Gothic" w:hAnsi="MS Gothic" w:cs="Calibri" w:hint="eastAsia"/>
+              <w:sz w:val="22"/>
+              <w:szCs w:val="22"/>
+            </w:rPr>
+            <w:t>☐</w:t>
+          </w:r>
+        </w:sdtContent>
+      </w:sdt>
+      <w:r>
+        <w:rPr>
+          <w:rFonts w:ascii="Calibri" w:hAnsi="Calibri" w:cs="Calibri"/>
+          <w:sz w:val="22"/>
+          <w:szCs w:val="22"/>
+        </w:rPr>
+        <w:t>  True       </w:t>
+      </w:r>
+      <w:sdt>
+        <w:sdtPr>
+          <w:rPr>
+            <w:rFonts w:ascii="Calibri" w:hAnsi="Calibri" w:cs="Calibri"/>
+            <w:sz w:val="22"/>
+            <w:szCs w:val="22"/>
+          </w:rPr>
+          <w:id w:val="-951401673"/>
+          <w14:checkbox>
+            <w14:checked w14:val="0"/>
+            <w14:checkedState w14:val="2612" w14:font="MS Gothic"/>
+            <w14:uncheckedState w14:val="2610" w14:font="MS Gothic"/>
+          </w14:checkbox>
+        </w:sdtPr>
+        <w:sdtContent>
+          <w:r>
+            <w:rPr>
+              <w:rFonts w:ascii="MS Gothic" w:eastAsia="MS Gothic" w:hAnsi="MS Gothic" w:cs="Calibri" w:hint="eastAsia"/>
+              <w:sz w:val="22"/>
+              <w:szCs w:val="22"/>
+            </w:rPr>
+            <w:t>☐</w:t>
+          </w:r>
+        </w:sdtContent>
+      </w:sdt>
+      <w:r>
+        <w:rPr>
+          <w:rFonts w:ascii="Calibri" w:hAnsi="Calibri" w:cs="Calibri"/>
+          <w:sz w:val="22"/>
+          <w:szCs w:val="22"/>
+        </w:rPr>
+        <w:t>  False</w:t>
       </w:r>
     </w:p>
     <w:p>
@@ -1049,61 +1640,136 @@
         <w:rPr>
           <w:rFonts w:ascii="Calibri" w:hAnsi="Calibri" w:cs="Calibri"/>
         </w:rPr>
-        <w:t>Checklist point: Keeps her dignity, privacy and confidentiality. Circle a, b or c.</w:t>
-      </w:r>
-    </w:p>
-    <w:p>
-      <w:pPr>
-        <w:pStyle w:val="opt"/>
-        <w:rPr>
-          <w:rFonts w:ascii="Calibri" w:hAnsi="Calibri" w:cs="Calibri"/>
-          <w:sz w:val="22"/>
-          <w:szCs w:val="22"/>
-        </w:rPr>
-      </w:pPr>
-      <w:r>
-        <w:rPr>
-          <w:rFonts w:ascii="Calibri" w:hAnsi="Calibri" w:cs="Calibri"/>
-          <w:sz w:val="22"/>
-          <w:szCs w:val="22"/>
-        </w:rPr>
-        <w:t>a) nobody</w:t>
-      </w:r>
-    </w:p>
-    <w:p>
-      <w:pPr>
-        <w:pStyle w:val="opt"/>
-        <w:rPr>
-          <w:rFonts w:ascii="Calibri" w:hAnsi="Calibri" w:cs="Calibri"/>
-          <w:sz w:val="22"/>
-          <w:szCs w:val="22"/>
-        </w:rPr>
-      </w:pPr>
-      <w:r>
-        <w:rPr>
-          <w:rFonts w:ascii="Calibri" w:hAnsi="Calibri" w:cs="Calibri"/>
-          <w:sz w:val="22"/>
-          <w:szCs w:val="22"/>
-        </w:rPr>
-        <w:t>b) the supervisor, Lance</w:t>
-      </w:r>
-    </w:p>
-    <w:p>
-      <w:pPr>
-        <w:pStyle w:val="opt"/>
-        <w:rPr>
-          <w:rFonts w:ascii="Calibri" w:hAnsi="Calibri" w:cs="Calibri"/>
-          <w:sz w:val="22"/>
-          <w:szCs w:val="22"/>
-        </w:rPr>
-      </w:pPr>
-      <w:r>
-        <w:rPr>
-          <w:rFonts w:ascii="Calibri" w:hAnsi="Calibri" w:cs="Calibri"/>
-          <w:sz w:val="22"/>
-          <w:szCs w:val="22"/>
-        </w:rPr>
-        <w:t>c) Cherry's neighbours</w:t>
+        <w:t>Checklist point: Keeps her dignity, privacy and confidentiality. Tick one box.</w:t>
+      </w:r>
+    </w:p>
+    <w:p>
+      <w:pPr>
+        <w:pStyle w:val="opt"/>
+        <w:rPr>
+          <w:rFonts w:ascii="Calibri" w:hAnsi="Calibri" w:cs="Calibri"/>
+          <w:sz w:val="22"/>
+          <w:szCs w:val="22"/>
+        </w:rPr>
+      </w:pPr>
+      <w:sdt>
+        <w:sdtPr>
+          <w:rPr>
+            <w:rFonts w:ascii="Calibri" w:hAnsi="Calibri" w:cs="Calibri"/>
+            <w:sz w:val="22"/>
+            <w:szCs w:val="22"/>
+          </w:rPr>
+          <w:id w:val="-917549138"/>
+          <w14:checkbox>
+            <w14:checked w14:val="0"/>
+            <w14:checkedState w14:val="2612" w14:font="MS Gothic"/>
+            <w14:uncheckedState w14:val="2610" w14:font="MS Gothic"/>
+          </w14:checkbox>
+        </w:sdtPr>
+        <w:sdtContent>
+          <w:r>
+            <w:rPr>
+              <w:rFonts w:ascii="MS Gothic" w:eastAsia="MS Gothic" w:hAnsi="MS Gothic" w:cs="Calibri" w:hint="eastAsia"/>
+              <w:sz w:val="22"/>
+              <w:szCs w:val="22"/>
+            </w:rPr>
+            <w:t>☐</w:t>
+          </w:r>
+        </w:sdtContent>
+      </w:sdt>
+      <w:r>
+        <w:rPr>
+          <w:rFonts w:ascii="Calibri" w:hAnsi="Calibri" w:cs="Calibri"/>
+          <w:sz w:val="22"/>
+          <w:szCs w:val="22"/>
+        </w:rPr>
+        <w:t>  a) nobody</w:t>
+      </w:r>
+    </w:p>
+    <w:p>
+      <w:pPr>
+        <w:pStyle w:val="opt"/>
+        <w:rPr>
+          <w:rFonts w:ascii="Calibri" w:hAnsi="Calibri" w:cs="Calibri"/>
+          <w:sz w:val="22"/>
+          <w:szCs w:val="22"/>
+        </w:rPr>
+      </w:pPr>
+      <w:sdt>
+        <w:sdtPr>
+          <w:rPr>
+            <w:rFonts w:ascii="Calibri" w:hAnsi="Calibri" w:cs="Calibri"/>
+            <w:sz w:val="22"/>
+            <w:szCs w:val="22"/>
+          </w:rPr>
+          <w:id w:val="1924998522"/>
+          <w14:checkbox>
+            <w14:checked w14:val="0"/>
+            <w14:checkedState w14:val="2612" w14:font="MS Gothic"/>
+            <w14:uncheckedState w14:val="2610" w14:font="MS Gothic"/>
+          </w14:checkbox>
+        </w:sdtPr>
+        <w:sdtContent>
+          <w:r>
+            <w:rPr>
+              <w:rFonts w:ascii="MS Gothic" w:eastAsia="MS Gothic" w:hAnsi="MS Gothic" w:cs="Calibri" w:hint="eastAsia"/>
+              <w:sz w:val="22"/>
+              <w:szCs w:val="22"/>
+            </w:rPr>
+            <w:t>☐</w:t>
+          </w:r>
+        </w:sdtContent>
+      </w:sdt>
+      <w:r>
+        <w:rPr>
+          <w:rFonts w:ascii="Calibri" w:hAnsi="Calibri" w:cs="Calibri"/>
+          <w:sz w:val="22"/>
+          <w:szCs w:val="22"/>
+        </w:rPr>
+        <w:t>  b) the supervisor, Lance</w:t>
+      </w:r>
+    </w:p>
+    <w:p>
+      <w:pPr>
+        <w:pStyle w:val="opt"/>
+        <w:rPr>
+          <w:rFonts w:ascii="Calibri" w:hAnsi="Calibri" w:cs="Calibri"/>
+          <w:sz w:val="22"/>
+          <w:szCs w:val="22"/>
+        </w:rPr>
+      </w:pPr>
+      <w:sdt>
+        <w:sdtPr>
+          <w:rPr>
+            <w:rFonts w:ascii="Calibri" w:hAnsi="Calibri" w:cs="Calibri"/>
+            <w:sz w:val="22"/>
+            <w:szCs w:val="22"/>
+          </w:rPr>
+          <w:id w:val="1359001979"/>
+          <w14:checkbox>
+            <w14:checked w14:val="0"/>
+            <w14:checkedState w14:val="2612" w14:font="MS Gothic"/>
+            <w14:uncheckedState w14:val="2610" w14:font="MS Gothic"/>
+          </w14:checkbox>
+        </w:sdtPr>
+        <w:sdtContent>
+          <w:r>
+            <w:rPr>
+              <w:rFonts w:ascii="MS Gothic" w:eastAsia="MS Gothic" w:hAnsi="MS Gothic" w:cs="Calibri" w:hint="eastAsia"/>
+              <w:sz w:val="22"/>
+              <w:szCs w:val="22"/>
+            </w:rPr>
+            <w:t>☐</w:t>
+          </w:r>
+        </w:sdtContent>
+      </w:sdt>
+      <w:r>
+        <w:rPr>
+          <w:rFonts w:ascii="Calibri" w:hAnsi="Calibri" w:cs="Calibri"/>
+          <w:sz w:val="22"/>
+          <w:szCs w:val="22"/>
+        </w:rPr>
+        <w:t>  c) Cherry's neighbours</w:t>
       </w:r>
     </w:p>
     <w:p>
@@ -1137,25 +1803,83 @@
         <w:rPr>
           <w:rFonts w:ascii="Calibri" w:hAnsi="Calibri" w:cs="Calibri"/>
         </w:rPr>
-        <w:t>Checklist point: Meets your duty of care. Circle True or False.</w:t>
-      </w:r>
-    </w:p>
-    <w:p>
-      <w:pPr>
-        <w:pStyle w:val="opt"/>
-        <w:rPr>
-          <w:rFonts w:ascii="Calibri" w:hAnsi="Calibri" w:cs="Calibri"/>
-          <w:sz w:val="22"/>
-          <w:szCs w:val="22"/>
-        </w:rPr>
-      </w:pPr>
-      <w:r>
-        <w:rPr>
-          <w:rFonts w:ascii="Calibri" w:hAnsi="Calibri" w:cs="Calibri"/>
-          <w:sz w:val="22"/>
-          <w:szCs w:val="22"/>
-        </w:rPr>
-        <w:t>True   /   False</w:t>
+        <w:t>Checklist point: Meets your duty of care. Tick True or False.</w:t>
+      </w:r>
+    </w:p>
+    <w:p>
+      <w:pPr>
+        <w:pStyle w:val="opt"/>
+        <w:rPr>
+          <w:rFonts w:ascii="Calibri" w:hAnsi="Calibri" w:cs="Calibri"/>
+          <w:sz w:val="22"/>
+          <w:szCs w:val="22"/>
+        </w:rPr>
+      </w:pPr>
+      <w:sdt>
+        <w:sdtPr>
+          <w:rPr>
+            <w:rFonts w:ascii="Calibri" w:hAnsi="Calibri" w:cs="Calibri"/>
+            <w:sz w:val="22"/>
+            <w:szCs w:val="22"/>
+          </w:rPr>
+          <w:id w:val="-1228144903"/>
+          <w14:checkbox>
+            <w14:checked w14:val="0"/>
+            <w14:checkedState w14:val="2612" w14:font="MS Gothic"/>
+            <w14:uncheckedState w14:val="2610" w14:font="MS Gothic"/>
+          </w14:checkbox>
+        </w:sdtPr>
+        <w:sdtContent>
+          <w:r>
+            <w:rPr>
+              <w:rFonts w:ascii="MS Gothic" w:eastAsia="MS Gothic" w:hAnsi="MS Gothic" w:cs="Calibri" w:hint="eastAsia"/>
+              <w:sz w:val="22"/>
+              <w:szCs w:val="22"/>
+            </w:rPr>
+            <w:t>☐</w:t>
+          </w:r>
+        </w:sdtContent>
+      </w:sdt>
+      <w:r>
+        <w:rPr>
+          <w:rFonts w:ascii="Calibri" w:hAnsi="Calibri" w:cs="Calibri"/>
+          <w:sz w:val="22"/>
+          <w:szCs w:val="22"/>
+        </w:rPr>
+        <w:t>  True       </w:t>
+      </w:r>
+      <w:sdt>
+        <w:sdtPr>
+          <w:rPr>
+            <w:rFonts w:ascii="Calibri" w:hAnsi="Calibri" w:cs="Calibri"/>
+            <w:sz w:val="22"/>
+            <w:szCs w:val="22"/>
+          </w:rPr>
+          <w:id w:val="1200830498"/>
+          <w14:checkbox>
+            <w14:checked w14:val="0"/>
+            <w14:checkedState w14:val="2612" w14:font="MS Gothic"/>
+            <w14:uncheckedState w14:val="2610" w14:font="MS Gothic"/>
+          </w14:checkbox>
+        </w:sdtPr>
+        <w:sdtContent>
+          <w:r>
+            <w:rPr>
+              <w:rFonts w:ascii="MS Gothic" w:eastAsia="MS Gothic" w:hAnsi="MS Gothic" w:cs="Calibri" w:hint="eastAsia"/>
+              <w:sz w:val="22"/>
+              <w:szCs w:val="22"/>
+            </w:rPr>
+            <w:t>☐</w:t>
+          </w:r>
+        </w:sdtContent>
+      </w:sdt>
+      <w:r>
+        <w:rPr>
+          <w:rFonts w:ascii="Calibri" w:hAnsi="Calibri" w:cs="Calibri"/>
+          <w:sz w:val="22"/>
+          <w:szCs w:val="22"/>
+        </w:rPr>
+        <w:t>  False</w:t>
       </w:r>
     </w:p>
     <w:p>
@@ -1300,25 +2024,83 @@
         <w:rPr>
           <w:rFonts w:ascii="Calibri" w:hAnsi="Calibri" w:cs="Calibri"/>
         </w:rPr>
-        <w:t>Checklist point: Help her do what she can herself. Circle True or False.</w:t>
-      </w:r>
-    </w:p>
-    <w:p>
-      <w:pPr>
-        <w:pStyle w:val="opt"/>
-        <w:rPr>
-          <w:rFonts w:ascii="Calibri" w:hAnsi="Calibri" w:cs="Calibri"/>
-          <w:sz w:val="22"/>
-          <w:szCs w:val="22"/>
-        </w:rPr>
-      </w:pPr>
-      <w:r>
-        <w:rPr>
-          <w:rFonts w:ascii="Calibri" w:hAnsi="Calibri" w:cs="Calibri"/>
-          <w:sz w:val="22"/>
-          <w:szCs w:val="22"/>
-        </w:rPr>
-        <w:t>True   /   False</w:t>
+        <w:t>Checklist point: Help her do what she can herself. Tick True or False.</w:t>
+      </w:r>
+    </w:p>
+    <w:p>
+      <w:pPr>
+        <w:pStyle w:val="opt"/>
+        <w:rPr>
+          <w:rFonts w:ascii="Calibri" w:hAnsi="Calibri" w:cs="Calibri"/>
+          <w:sz w:val="22"/>
+          <w:szCs w:val="22"/>
+        </w:rPr>
+      </w:pPr>
+      <w:sdt>
+        <w:sdtPr>
+          <w:rPr>
+            <w:rFonts w:ascii="Calibri" w:hAnsi="Calibri" w:cs="Calibri"/>
+            <w:sz w:val="22"/>
+            <w:szCs w:val="22"/>
+          </w:rPr>
+          <w:id w:val="-454794598"/>
+          <w14:checkbox>
+            <w14:checked w14:val="0"/>
+            <w14:checkedState w14:val="2612" w14:font="MS Gothic"/>
+            <w14:uncheckedState w14:val="2610" w14:font="MS Gothic"/>
+          </w14:checkbox>
+        </w:sdtPr>
+        <w:sdtContent>
+          <w:r>
+            <w:rPr>
+              <w:rFonts w:ascii="MS Gothic" w:eastAsia="MS Gothic" w:hAnsi="MS Gothic" w:cs="Calibri" w:hint="eastAsia"/>
+              <w:sz w:val="22"/>
+              <w:szCs w:val="22"/>
+            </w:rPr>
+            <w:t>☐</w:t>
+          </w:r>
+        </w:sdtContent>
+      </w:sdt>
+      <w:r>
+        <w:rPr>
+          <w:rFonts w:ascii="Calibri" w:hAnsi="Calibri" w:cs="Calibri"/>
+          <w:sz w:val="22"/>
+          <w:szCs w:val="22"/>
+        </w:rPr>
+        <w:t>  True       </w:t>
+      </w:r>
+      <w:sdt>
+        <w:sdtPr>
+          <w:rPr>
+            <w:rFonts w:ascii="Calibri" w:hAnsi="Calibri" w:cs="Calibri"/>
+            <w:sz w:val="22"/>
+            <w:szCs w:val="22"/>
+          </w:rPr>
+          <w:id w:val="-546608587"/>
+          <w14:checkbox>
+            <w14:checked w14:val="0"/>
+            <w14:checkedState w14:val="2612" w14:font="MS Gothic"/>
+            <w14:uncheckedState w14:val="2610" w14:font="MS Gothic"/>
+          </w14:checkbox>
+        </w:sdtPr>
+        <w:sdtContent>
+          <w:r>
+            <w:rPr>
+              <w:rFonts w:ascii="MS Gothic" w:eastAsia="MS Gothic" w:hAnsi="MS Gothic" w:cs="Calibri" w:hint="eastAsia"/>
+              <w:sz w:val="22"/>
+              <w:szCs w:val="22"/>
+            </w:rPr>
+            <w:t>☐</w:t>
+          </w:r>
+        </w:sdtContent>
+      </w:sdt>
+      <w:r>
+        <w:rPr>
+          <w:rFonts w:ascii="Calibri" w:hAnsi="Calibri" w:cs="Calibri"/>
+          <w:sz w:val="22"/>
+          <w:szCs w:val="22"/>
+        </w:rPr>
+        <w:t>  False</w:t>
       </w:r>
     </w:p>
     <w:p>
@@ -1409,61 +2191,136 @@
         <w:rPr>
           <w:rFonts w:ascii="Calibri" w:hAnsi="Calibri" w:cs="Calibri"/>
         </w:rPr>
-        <w:t>Checklist point: Help her see what she can still do for herself. Circle a, b or c.</w:t>
-      </w:r>
-    </w:p>
-    <w:p>
-      <w:pPr>
-        <w:pStyle w:val="opt"/>
-        <w:rPr>
-          <w:rFonts w:ascii="Calibri" w:hAnsi="Calibri" w:cs="Calibri"/>
-          <w:sz w:val="22"/>
-          <w:szCs w:val="22"/>
-        </w:rPr>
-      </w:pPr>
-      <w:r>
-        <w:rPr>
-          <w:rFonts w:ascii="Calibri" w:hAnsi="Calibri" w:cs="Calibri"/>
-          <w:sz w:val="22"/>
-          <w:szCs w:val="22"/>
-        </w:rPr>
-        <w:t>a) drive the car</w:t>
-      </w:r>
-    </w:p>
-    <w:p>
-      <w:pPr>
-        <w:pStyle w:val="opt"/>
-        <w:rPr>
-          <w:rFonts w:ascii="Calibri" w:hAnsi="Calibri" w:cs="Calibri"/>
-          <w:sz w:val="22"/>
-          <w:szCs w:val="22"/>
-        </w:rPr>
-      </w:pPr>
-      <w:r>
-        <w:rPr>
-          <w:rFonts w:ascii="Calibri" w:hAnsi="Calibri" w:cs="Calibri"/>
-          <w:sz w:val="22"/>
-          <w:szCs w:val="22"/>
-        </w:rPr>
-        <w:t>b) shower and dress herself</w:t>
-      </w:r>
-    </w:p>
-    <w:p>
-      <w:pPr>
-        <w:pStyle w:val="opt"/>
-        <w:rPr>
-          <w:rFonts w:ascii="Calibri" w:hAnsi="Calibri" w:cs="Calibri"/>
-          <w:sz w:val="22"/>
-          <w:szCs w:val="22"/>
-        </w:rPr>
-      </w:pPr>
-      <w:r>
-        <w:rPr>
-          <w:rFonts w:ascii="Calibri" w:hAnsi="Calibri" w:cs="Calibri"/>
-          <w:sz w:val="22"/>
-          <w:szCs w:val="22"/>
-        </w:rPr>
-        <w:t>c) do all the shopping</w:t>
+        <w:t>Checklist point: Help her see what she can still do for herself. Tick one box.</w:t>
+      </w:r>
+    </w:p>
+    <w:p>
+      <w:pPr>
+        <w:pStyle w:val="opt"/>
+        <w:rPr>
+          <w:rFonts w:ascii="Calibri" w:hAnsi="Calibri" w:cs="Calibri"/>
+          <w:sz w:val="22"/>
+          <w:szCs w:val="22"/>
+        </w:rPr>
+      </w:pPr>
+      <w:sdt>
+        <w:sdtPr>
+          <w:rPr>
+            <w:rFonts w:ascii="Calibri" w:hAnsi="Calibri" w:cs="Calibri"/>
+            <w:sz w:val="22"/>
+            <w:szCs w:val="22"/>
+          </w:rPr>
+          <w:id w:val="-699472773"/>
+          <w14:checkbox>
+            <w14:checked w14:val="0"/>
+            <w14:checkedState w14:val="2612" w14:font="MS Gothic"/>
+            <w14:uncheckedState w14:val="2610" w14:font="MS Gothic"/>
+          </w14:checkbox>
+        </w:sdtPr>
+        <w:sdtContent>
+          <w:r>
+            <w:rPr>
+              <w:rFonts w:ascii="MS Gothic" w:eastAsia="MS Gothic" w:hAnsi="MS Gothic" w:cs="Calibri" w:hint="eastAsia"/>
+              <w:sz w:val="22"/>
+              <w:szCs w:val="22"/>
+            </w:rPr>
+            <w:t>☐</w:t>
+          </w:r>
+        </w:sdtContent>
+      </w:sdt>
+      <w:r>
+        <w:rPr>
+          <w:rFonts w:ascii="Calibri" w:hAnsi="Calibri" w:cs="Calibri"/>
+          <w:sz w:val="22"/>
+          <w:szCs w:val="22"/>
+        </w:rPr>
+        <w:t>  a) drive the car</w:t>
+      </w:r>
+    </w:p>
+    <w:p>
+      <w:pPr>
+        <w:pStyle w:val="opt"/>
+        <w:rPr>
+          <w:rFonts w:ascii="Calibri" w:hAnsi="Calibri" w:cs="Calibri"/>
+          <w:sz w:val="22"/>
+          <w:szCs w:val="22"/>
+        </w:rPr>
+      </w:pPr>
+      <w:sdt>
+        <w:sdtPr>
+          <w:rPr>
+            <w:rFonts w:ascii="Calibri" w:hAnsi="Calibri" w:cs="Calibri"/>
+            <w:sz w:val="22"/>
+            <w:szCs w:val="22"/>
+          </w:rPr>
+          <w:id w:val="-796446264"/>
+          <w14:checkbox>
+            <w14:checked w14:val="0"/>
+            <w14:checkedState w14:val="2612" w14:font="MS Gothic"/>
+            <w14:uncheckedState w14:val="2610" w14:font="MS Gothic"/>
+          </w14:checkbox>
+        </w:sdtPr>
+        <w:sdtContent>
+          <w:r>
+            <w:rPr>
+              <w:rFonts w:ascii="MS Gothic" w:eastAsia="MS Gothic" w:hAnsi="MS Gothic" w:cs="Calibri" w:hint="eastAsia"/>
+              <w:sz w:val="22"/>
+              <w:szCs w:val="22"/>
+            </w:rPr>
+            <w:t>☐</w:t>
+          </w:r>
+        </w:sdtContent>
+      </w:sdt>
+      <w:r>
+        <w:rPr>
+          <w:rFonts w:ascii="Calibri" w:hAnsi="Calibri" w:cs="Calibri"/>
+          <w:sz w:val="22"/>
+          <w:szCs w:val="22"/>
+        </w:rPr>
+        <w:t>  b) shower and dress herself</w:t>
+      </w:r>
+    </w:p>
+    <w:p>
+      <w:pPr>
+        <w:pStyle w:val="opt"/>
+        <w:rPr>
+          <w:rFonts w:ascii="Calibri" w:hAnsi="Calibri" w:cs="Calibri"/>
+          <w:sz w:val="22"/>
+          <w:szCs w:val="22"/>
+        </w:rPr>
+      </w:pPr>
+      <w:sdt>
+        <w:sdtPr>
+          <w:rPr>
+            <w:rFonts w:ascii="Calibri" w:hAnsi="Calibri" w:cs="Calibri"/>
+            <w:sz w:val="22"/>
+            <w:szCs w:val="22"/>
+          </w:rPr>
+          <w:id w:val="1103538355"/>
+          <w14:checkbox>
+            <w14:checked w14:val="0"/>
+            <w14:checkedState w14:val="2612" w14:font="MS Gothic"/>
+            <w14:uncheckedState w14:val="2610" w14:font="MS Gothic"/>
+          </w14:checkbox>
+        </w:sdtPr>
+        <w:sdtContent>
+          <w:r>
+            <w:rPr>
+              <w:rFonts w:ascii="MS Gothic" w:eastAsia="MS Gothic" w:hAnsi="MS Gothic" w:cs="Calibri" w:hint="eastAsia"/>
+              <w:sz w:val="22"/>
+              <w:szCs w:val="22"/>
+            </w:rPr>
+            <w:t>☐</w:t>
+          </w:r>
+        </w:sdtContent>
+      </w:sdt>
+      <w:r>
+        <w:rPr>
+          <w:rFonts w:ascii="Calibri" w:hAnsi="Calibri" w:cs="Calibri"/>
+          <w:sz w:val="22"/>
+          <w:szCs w:val="22"/>
+        </w:rPr>
+        <w:t>  c) do all the shopping</w:t>
       </w:r>
     </w:p>
     <w:p>
@@ -1497,25 +2354,83 @@
         <w:rPr>
           <w:rFonts w:ascii="Calibri" w:hAnsi="Calibri" w:cs="Calibri"/>
         </w:rPr>
-        <w:t>Checklist point: Do not push your own values. Circle True or False.</w:t>
-      </w:r>
-    </w:p>
-    <w:p>
-      <w:pPr>
-        <w:pStyle w:val="opt"/>
-        <w:rPr>
-          <w:rFonts w:ascii="Calibri" w:hAnsi="Calibri" w:cs="Calibri"/>
-          <w:sz w:val="22"/>
-          <w:szCs w:val="22"/>
-        </w:rPr>
-      </w:pPr>
-      <w:r>
-        <w:rPr>
-          <w:rFonts w:ascii="Calibri" w:hAnsi="Calibri" w:cs="Calibri"/>
-          <w:sz w:val="22"/>
-          <w:szCs w:val="22"/>
-        </w:rPr>
-        <w:t>True   /   False</w:t>
+        <w:t>Checklist point: Do not push your own values. Tick True or False.</w:t>
+      </w:r>
+    </w:p>
+    <w:p>
+      <w:pPr>
+        <w:pStyle w:val="opt"/>
+        <w:rPr>
+          <w:rFonts w:ascii="Calibri" w:hAnsi="Calibri" w:cs="Calibri"/>
+          <w:sz w:val="22"/>
+          <w:szCs w:val="22"/>
+        </w:rPr>
+      </w:pPr>
+      <w:sdt>
+        <w:sdtPr>
+          <w:rPr>
+            <w:rFonts w:ascii="Calibri" w:hAnsi="Calibri" w:cs="Calibri"/>
+            <w:sz w:val="22"/>
+            <w:szCs w:val="22"/>
+          </w:rPr>
+          <w:id w:val="-598107158"/>
+          <w14:checkbox>
+            <w14:checked w14:val="0"/>
+            <w14:checkedState w14:val="2612" w14:font="MS Gothic"/>
+            <w14:uncheckedState w14:val="2610" w14:font="MS Gothic"/>
+          </w14:checkbox>
+        </w:sdtPr>
+        <w:sdtContent>
+          <w:r>
+            <w:rPr>
+              <w:rFonts w:ascii="MS Gothic" w:eastAsia="MS Gothic" w:hAnsi="MS Gothic" w:cs="Calibri" w:hint="eastAsia"/>
+              <w:sz w:val="22"/>
+              <w:szCs w:val="22"/>
+            </w:rPr>
+            <w:t>☐</w:t>
+          </w:r>
+        </w:sdtContent>
+      </w:sdt>
+      <w:r>
+        <w:rPr>
+          <w:rFonts w:ascii="Calibri" w:hAnsi="Calibri" w:cs="Calibri"/>
+          <w:sz w:val="22"/>
+          <w:szCs w:val="22"/>
+        </w:rPr>
+        <w:t>  True       </w:t>
+      </w:r>
+      <w:sdt>
+        <w:sdtPr>
+          <w:rPr>
+            <w:rFonts w:ascii="Calibri" w:hAnsi="Calibri" w:cs="Calibri"/>
+            <w:sz w:val="22"/>
+            <w:szCs w:val="22"/>
+          </w:rPr>
+          <w:id w:val="691575714"/>
+          <w14:checkbox>
+            <w14:checked w14:val="0"/>
+            <w14:checkedState w14:val="2612" w14:font="MS Gothic"/>
+            <w14:uncheckedState w14:val="2610" w14:font="MS Gothic"/>
+          </w14:checkbox>
+        </w:sdtPr>
+        <w:sdtContent>
+          <w:r>
+            <w:rPr>
+              <w:rFonts w:ascii="MS Gothic" w:eastAsia="MS Gothic" w:hAnsi="MS Gothic" w:cs="Calibri" w:hint="eastAsia"/>
+              <w:sz w:val="22"/>
+              <w:szCs w:val="22"/>
+            </w:rPr>
+            <w:t>☐</w:t>
+          </w:r>
+        </w:sdtContent>
+      </w:sdt>
+      <w:r>
+        <w:rPr>
+          <w:rFonts w:ascii="Calibri" w:hAnsi="Calibri" w:cs="Calibri"/>
+          <w:sz w:val="22"/>
+          <w:szCs w:val="22"/>
+        </w:rPr>
+        <w:t>  False</w:t>
       </w:r>
     </w:p>
     <w:p>
@@ -1572,25 +2487,83 @@
         <w:rPr>
           <w:rFonts w:ascii="Calibri" w:hAnsi="Calibri" w:cs="Calibri"/>
         </w:rPr>
-        <w:t>Checklist point: Her physical situation is affecting her wellbeing. Circle True or False.</w:t>
-      </w:r>
-    </w:p>
-    <w:p>
-      <w:pPr>
-        <w:pStyle w:val="opt"/>
-        <w:rPr>
-          <w:rFonts w:ascii="Calibri" w:hAnsi="Calibri" w:cs="Calibri"/>
-          <w:sz w:val="22"/>
-          <w:szCs w:val="22"/>
-        </w:rPr>
-      </w:pPr>
-      <w:r>
-        <w:rPr>
-          <w:rFonts w:ascii="Calibri" w:hAnsi="Calibri" w:cs="Calibri"/>
-          <w:sz w:val="22"/>
-          <w:szCs w:val="22"/>
-        </w:rPr>
-        <w:t>True   /   False</w:t>
+        <w:t>Checklist point: Her physical situation is affecting her wellbeing. Tick True or False.</w:t>
+      </w:r>
+    </w:p>
+    <w:p>
+      <w:pPr>
+        <w:pStyle w:val="opt"/>
+        <w:rPr>
+          <w:rFonts w:ascii="Calibri" w:hAnsi="Calibri" w:cs="Calibri"/>
+          <w:sz w:val="22"/>
+          <w:szCs w:val="22"/>
+        </w:rPr>
+      </w:pPr>
+      <w:sdt>
+        <w:sdtPr>
+          <w:rPr>
+            <w:rFonts w:ascii="Calibri" w:hAnsi="Calibri" w:cs="Calibri"/>
+            <w:sz w:val="22"/>
+            <w:szCs w:val="22"/>
+          </w:rPr>
+          <w:id w:val="-116451512"/>
+          <w14:checkbox>
+            <w14:checked w14:val="0"/>
+            <w14:checkedState w14:val="2612" w14:font="MS Gothic"/>
+            <w14:uncheckedState w14:val="2610" w14:font="MS Gothic"/>
+          </w14:checkbox>
+        </w:sdtPr>
+        <w:sdtContent>
+          <w:r>
+            <w:rPr>
+              <w:rFonts w:ascii="MS Gothic" w:eastAsia="MS Gothic" w:hAnsi="MS Gothic" w:cs="Calibri" w:hint="eastAsia"/>
+              <w:sz w:val="22"/>
+              <w:szCs w:val="22"/>
+            </w:rPr>
+            <w:t>☐</w:t>
+          </w:r>
+        </w:sdtContent>
+      </w:sdt>
+      <w:r>
+        <w:rPr>
+          <w:rFonts w:ascii="Calibri" w:hAnsi="Calibri" w:cs="Calibri"/>
+          <w:sz w:val="22"/>
+          <w:szCs w:val="22"/>
+        </w:rPr>
+        <w:t>  True       </w:t>
+      </w:r>
+      <w:sdt>
+        <w:sdtPr>
+          <w:rPr>
+            <w:rFonts w:ascii="Calibri" w:hAnsi="Calibri" w:cs="Calibri"/>
+            <w:sz w:val="22"/>
+            <w:szCs w:val="22"/>
+          </w:rPr>
+          <w:id w:val="-1257043161"/>
+          <w14:checkbox>
+            <w14:checked w14:val="0"/>
+            <w14:checkedState w14:val="2612" w14:font="MS Gothic"/>
+            <w14:uncheckedState w14:val="2610" w14:font="MS Gothic"/>
+          </w14:checkbox>
+        </w:sdtPr>
+        <w:sdtContent>
+          <w:r>
+            <w:rPr>
+              <w:rFonts w:ascii="MS Gothic" w:eastAsia="MS Gothic" w:hAnsi="MS Gothic" w:cs="Calibri" w:hint="eastAsia"/>
+              <w:sz w:val="22"/>
+              <w:szCs w:val="22"/>
+            </w:rPr>
+            <w:t>☐</w:t>
+          </w:r>
+        </w:sdtContent>
+      </w:sdt>
+      <w:r>
+        <w:rPr>
+          <w:rFonts w:ascii="Calibri" w:hAnsi="Calibri" w:cs="Calibri"/>
+          <w:sz w:val="22"/>
+          <w:szCs w:val="22"/>
+        </w:rPr>
+        <w:t>  False</w:t>
       </w:r>
     </w:p>
     <w:p>
@@ -1624,25 +2597,83 @@
         <w:rPr>
           <w:rFonts w:ascii="Calibri" w:hAnsi="Calibri" w:cs="Calibri"/>
         </w:rPr>
-        <w:t>Checklist point: Her wellbeing has changed. Circle True or False.</w:t>
-      </w:r>
-    </w:p>
-    <w:p>
-      <w:pPr>
-        <w:pStyle w:val="opt"/>
-        <w:rPr>
-          <w:rFonts w:ascii="Calibri" w:hAnsi="Calibri" w:cs="Calibri"/>
-          <w:sz w:val="22"/>
-          <w:szCs w:val="22"/>
-        </w:rPr>
-      </w:pPr>
-      <w:r>
-        <w:rPr>
-          <w:rFonts w:ascii="Calibri" w:hAnsi="Calibri" w:cs="Calibri"/>
-          <w:sz w:val="22"/>
-          <w:szCs w:val="22"/>
-        </w:rPr>
-        <w:t>True   /   False</w:t>
+        <w:t>Checklist point: Her wellbeing has changed. Tick True or False.</w:t>
+      </w:r>
+    </w:p>
+    <w:p>
+      <w:pPr>
+        <w:pStyle w:val="opt"/>
+        <w:rPr>
+          <w:rFonts w:ascii="Calibri" w:hAnsi="Calibri" w:cs="Calibri"/>
+          <w:sz w:val="22"/>
+          <w:szCs w:val="22"/>
+        </w:rPr>
+      </w:pPr>
+      <w:sdt>
+        <w:sdtPr>
+          <w:rPr>
+            <w:rFonts w:ascii="Calibri" w:hAnsi="Calibri" w:cs="Calibri"/>
+            <w:sz w:val="22"/>
+            <w:szCs w:val="22"/>
+          </w:rPr>
+          <w:id w:val="1350915439"/>
+          <w14:checkbox>
+            <w14:checked w14:val="0"/>
+            <w14:checkedState w14:val="2612" w14:font="MS Gothic"/>
+            <w14:uncheckedState w14:val="2610" w14:font="MS Gothic"/>
+          </w14:checkbox>
+        </w:sdtPr>
+        <w:sdtContent>
+          <w:r>
+            <w:rPr>
+              <w:rFonts w:ascii="MS Gothic" w:eastAsia="MS Gothic" w:hAnsi="MS Gothic" w:cs="Calibri" w:hint="eastAsia"/>
+              <w:sz w:val="22"/>
+              <w:szCs w:val="22"/>
+            </w:rPr>
+            <w:t>☐</w:t>
+          </w:r>
+        </w:sdtContent>
+      </w:sdt>
+      <w:r>
+        <w:rPr>
+          <w:rFonts w:ascii="Calibri" w:hAnsi="Calibri" w:cs="Calibri"/>
+          <w:sz w:val="22"/>
+          <w:szCs w:val="22"/>
+        </w:rPr>
+        <w:t>  True       </w:t>
+      </w:r>
+      <w:sdt>
+        <w:sdtPr>
+          <w:rPr>
+            <w:rFonts w:ascii="Calibri" w:hAnsi="Calibri" w:cs="Calibri"/>
+            <w:sz w:val="22"/>
+            <w:szCs w:val="22"/>
+          </w:rPr>
+          <w:id w:val="-609811813"/>
+          <w14:checkbox>
+            <w14:checked w14:val="0"/>
+            <w14:checkedState w14:val="2612" w14:font="MS Gothic"/>
+            <w14:uncheckedState w14:val="2610" w14:font="MS Gothic"/>
+          </w14:checkbox>
+        </w:sdtPr>
+        <w:sdtContent>
+          <w:r>
+            <w:rPr>
+              <w:rFonts w:ascii="MS Gothic" w:eastAsia="MS Gothic" w:hAnsi="MS Gothic" w:cs="Calibri" w:hint="eastAsia"/>
+              <w:sz w:val="22"/>
+              <w:szCs w:val="22"/>
+            </w:rPr>
+            <w:t>☐</w:t>
+          </w:r>
+        </w:sdtContent>
+      </w:sdt>
+      <w:r>
+        <w:rPr>
+          <w:rFonts w:ascii="Calibri" w:hAnsi="Calibri" w:cs="Calibri"/>
+          <w:sz w:val="22"/>
+          <w:szCs w:val="22"/>
+        </w:rPr>
+        <w:t>  False</w:t>
       </w:r>
     </w:p>
     <w:p>
@@ -1676,61 +2707,136 @@
         <w:rPr>
           <w:rFonts w:ascii="Calibri" w:hAnsi="Calibri" w:cs="Calibri"/>
         </w:rPr>
-        <w:t>Checklist point: Some things are outside your job. Circle a, b or c.</w:t>
-      </w:r>
-    </w:p>
-    <w:p>
-      <w:pPr>
-        <w:pStyle w:val="opt"/>
-        <w:rPr>
-          <w:rFonts w:ascii="Calibri" w:hAnsi="Calibri" w:cs="Calibri"/>
-          <w:sz w:val="22"/>
-          <w:szCs w:val="22"/>
-        </w:rPr>
-      </w:pPr>
-      <w:r>
-        <w:rPr>
-          <w:rFonts w:ascii="Calibri" w:hAnsi="Calibri" w:cs="Calibri"/>
-          <w:sz w:val="22"/>
-          <w:szCs w:val="22"/>
-        </w:rPr>
-        <w:t>a) the support worker</w:t>
-      </w:r>
-    </w:p>
-    <w:p>
-      <w:pPr>
-        <w:pStyle w:val="opt"/>
-        <w:rPr>
-          <w:rFonts w:ascii="Calibri" w:hAnsi="Calibri" w:cs="Calibri"/>
-          <w:sz w:val="22"/>
-          <w:szCs w:val="22"/>
-        </w:rPr>
-      </w:pPr>
-      <w:r>
-        <w:rPr>
-          <w:rFonts w:ascii="Calibri" w:hAnsi="Calibri" w:cs="Calibri"/>
-          <w:sz w:val="22"/>
-          <w:szCs w:val="22"/>
-        </w:rPr>
-        <w:t>b) a support service such as OPAN</w:t>
-      </w:r>
-    </w:p>
-    <w:p>
-      <w:pPr>
-        <w:pStyle w:val="opt"/>
-        <w:rPr>
-          <w:rFonts w:ascii="Calibri" w:hAnsi="Calibri" w:cs="Calibri"/>
-          <w:sz w:val="22"/>
-          <w:szCs w:val="22"/>
-        </w:rPr>
-      </w:pPr>
-      <w:r>
-        <w:rPr>
-          <w:rFonts w:ascii="Calibri" w:hAnsi="Calibri" w:cs="Calibri"/>
-          <w:sz w:val="22"/>
-          <w:szCs w:val="22"/>
-        </w:rPr>
-        <w:t>c) Donna</w:t>
+        <w:t>Checklist point: Some things are outside your job. Tick one box.</w:t>
+      </w:r>
+    </w:p>
+    <w:p>
+      <w:pPr>
+        <w:pStyle w:val="opt"/>
+        <w:rPr>
+          <w:rFonts w:ascii="Calibri" w:hAnsi="Calibri" w:cs="Calibri"/>
+          <w:sz w:val="22"/>
+          <w:szCs w:val="22"/>
+        </w:rPr>
+      </w:pPr>
+      <w:sdt>
+        <w:sdtPr>
+          <w:rPr>
+            <w:rFonts w:ascii="Calibri" w:hAnsi="Calibri" w:cs="Calibri"/>
+            <w:sz w:val="22"/>
+            <w:szCs w:val="22"/>
+          </w:rPr>
+          <w:id w:val="-6137092"/>
+          <w14:checkbox>
+            <w14:checked w14:val="0"/>
+            <w14:checkedState w14:val="2612" w14:font="MS Gothic"/>
+            <w14:uncheckedState w14:val="2610" w14:font="MS Gothic"/>
+          </w14:checkbox>
+        </w:sdtPr>
+        <w:sdtContent>
+          <w:r>
+            <w:rPr>
+              <w:rFonts w:ascii="MS Gothic" w:eastAsia="MS Gothic" w:hAnsi="MS Gothic" w:cs="Calibri" w:hint="eastAsia"/>
+              <w:sz w:val="22"/>
+              <w:szCs w:val="22"/>
+            </w:rPr>
+            <w:t>☐</w:t>
+          </w:r>
+        </w:sdtContent>
+      </w:sdt>
+      <w:r>
+        <w:rPr>
+          <w:rFonts w:ascii="Calibri" w:hAnsi="Calibri" w:cs="Calibri"/>
+          <w:sz w:val="22"/>
+          <w:szCs w:val="22"/>
+        </w:rPr>
+        <w:t>  a) the support worker</w:t>
+      </w:r>
+    </w:p>
+    <w:p>
+      <w:pPr>
+        <w:pStyle w:val="opt"/>
+        <w:rPr>
+          <w:rFonts w:ascii="Calibri" w:hAnsi="Calibri" w:cs="Calibri"/>
+          <w:sz w:val="22"/>
+          <w:szCs w:val="22"/>
+        </w:rPr>
+      </w:pPr>
+      <w:sdt>
+        <w:sdtPr>
+          <w:rPr>
+            <w:rFonts w:ascii="Calibri" w:hAnsi="Calibri" w:cs="Calibri"/>
+            <w:sz w:val="22"/>
+            <w:szCs w:val="22"/>
+          </w:rPr>
+          <w:id w:val="-659001604"/>
+          <w14:checkbox>
+            <w14:checked w14:val="0"/>
+            <w14:checkedState w14:val="2612" w14:font="MS Gothic"/>
+            <w14:uncheckedState w14:val="2610" w14:font="MS Gothic"/>
+          </w14:checkbox>
+        </w:sdtPr>
+        <w:sdtContent>
+          <w:r>
+            <w:rPr>
+              <w:rFonts w:ascii="MS Gothic" w:eastAsia="MS Gothic" w:hAnsi="MS Gothic" w:cs="Calibri" w:hint="eastAsia"/>
+              <w:sz w:val="22"/>
+              <w:szCs w:val="22"/>
+            </w:rPr>
+            <w:t>☐</w:t>
+          </w:r>
+        </w:sdtContent>
+      </w:sdt>
+      <w:r>
+        <w:rPr>
+          <w:rFonts w:ascii="Calibri" w:hAnsi="Calibri" w:cs="Calibri"/>
+          <w:sz w:val="22"/>
+          <w:szCs w:val="22"/>
+        </w:rPr>
+        <w:t>  b) a support service such as OPAN</w:t>
+      </w:r>
+    </w:p>
+    <w:p>
+      <w:pPr>
+        <w:pStyle w:val="opt"/>
+        <w:rPr>
+          <w:rFonts w:ascii="Calibri" w:hAnsi="Calibri" w:cs="Calibri"/>
+          <w:sz w:val="22"/>
+          <w:szCs w:val="22"/>
+        </w:rPr>
+      </w:pPr>
+      <w:sdt>
+        <w:sdtPr>
+          <w:rPr>
+            <w:rFonts w:ascii="Calibri" w:hAnsi="Calibri" w:cs="Calibri"/>
+            <w:sz w:val="22"/>
+            <w:szCs w:val="22"/>
+          </w:rPr>
+          <w:id w:val="-1847780035"/>
+          <w14:checkbox>
+            <w14:checked w14:val="0"/>
+            <w14:checkedState w14:val="2612" w14:font="MS Gothic"/>
+            <w14:uncheckedState w14:val="2610" w14:font="MS Gothic"/>
+          </w14:checkbox>
+        </w:sdtPr>
+        <w:sdtContent>
+          <w:r>
+            <w:rPr>
+              <w:rFonts w:ascii="MS Gothic" w:eastAsia="MS Gothic" w:hAnsi="MS Gothic" w:cs="Calibri" w:hint="eastAsia"/>
+              <w:sz w:val="22"/>
+              <w:szCs w:val="22"/>
+            </w:rPr>
+            <w:t>☐</w:t>
+          </w:r>
+        </w:sdtContent>
+      </w:sdt>
+      <w:r>
+        <w:rPr>
+          <w:rFonts w:ascii="Calibri" w:hAnsi="Calibri" w:cs="Calibri"/>
+          <w:sz w:val="22"/>
+          <w:szCs w:val="22"/>
+        </w:rPr>
+        <w:t>  c) Donna</w:t>
       </w:r>
     </w:p>
     <w:p>
@@ -1749,15 +2855,7 @@
           <w:sz w:val="22"/>
           <w:szCs w:val="22"/>
         </w:rPr>
-        <w:t>24. More of Cherry'</w:t>
-      </w:r>
-      <w:r>
-        <w:rPr>
-          <w:rFonts w:ascii="Calibri" w:hAnsi="Calibri" w:cs="Calibri"/>
-          <w:sz w:val="22"/>
-          <w:szCs w:val="22"/>
-        </w:rPr>
-        <w:t>s ornaments could go missing. This is a risk.</w:t>
+        <w:t>24. More of Cherry's ornaments could go missing. This is a risk.</w:t>
       </w:r>
     </w:p>
     <w:p>
@@ -1772,25 +2870,83 @@
         <w:rPr>
           <w:rFonts w:ascii="Calibri" w:hAnsi="Calibri" w:cs="Calibri"/>
         </w:rPr>
-        <w:t>Checklist point: There are signs of risk. Circle True or False.</w:t>
-      </w:r>
-    </w:p>
-    <w:p>
-      <w:pPr>
-        <w:pStyle w:val="opt"/>
-        <w:rPr>
-          <w:rFonts w:ascii="Calibri" w:hAnsi="Calibri" w:cs="Calibri"/>
-          <w:sz w:val="22"/>
-          <w:szCs w:val="22"/>
-        </w:rPr>
-      </w:pPr>
-      <w:r>
-        <w:rPr>
-          <w:rFonts w:ascii="Calibri" w:hAnsi="Calibri" w:cs="Calibri"/>
-          <w:sz w:val="22"/>
-          <w:szCs w:val="22"/>
-        </w:rPr>
-        <w:t>True   /   False</w:t>
+        <w:t>Checklist point: There are signs of risk. Tick True or False.</w:t>
+      </w:r>
+    </w:p>
+    <w:p>
+      <w:pPr>
+        <w:pStyle w:val="opt"/>
+        <w:rPr>
+          <w:rFonts w:ascii="Calibri" w:hAnsi="Calibri" w:cs="Calibri"/>
+          <w:sz w:val="22"/>
+          <w:szCs w:val="22"/>
+        </w:rPr>
+      </w:pPr>
+      <w:sdt>
+        <w:sdtPr>
+          <w:rPr>
+            <w:rFonts w:ascii="Calibri" w:hAnsi="Calibri" w:cs="Calibri"/>
+            <w:sz w:val="22"/>
+            <w:szCs w:val="22"/>
+          </w:rPr>
+          <w:id w:val="1629820868"/>
+          <w14:checkbox>
+            <w14:checked w14:val="0"/>
+            <w14:checkedState w14:val="2612" w14:font="MS Gothic"/>
+            <w14:uncheckedState w14:val="2610" w14:font="MS Gothic"/>
+          </w14:checkbox>
+        </w:sdtPr>
+        <w:sdtContent>
+          <w:r>
+            <w:rPr>
+              <w:rFonts w:ascii="MS Gothic" w:eastAsia="MS Gothic" w:hAnsi="MS Gothic" w:cs="Calibri" w:hint="eastAsia"/>
+              <w:sz w:val="22"/>
+              <w:szCs w:val="22"/>
+            </w:rPr>
+            <w:t>☐</w:t>
+          </w:r>
+        </w:sdtContent>
+      </w:sdt>
+      <w:r>
+        <w:rPr>
+          <w:rFonts w:ascii="Calibri" w:hAnsi="Calibri" w:cs="Calibri"/>
+          <w:sz w:val="22"/>
+          <w:szCs w:val="22"/>
+        </w:rPr>
+        <w:t>  True       </w:t>
+      </w:r>
+      <w:sdt>
+        <w:sdtPr>
+          <w:rPr>
+            <w:rFonts w:ascii="Calibri" w:hAnsi="Calibri" w:cs="Calibri"/>
+            <w:sz w:val="22"/>
+            <w:szCs w:val="22"/>
+          </w:rPr>
+          <w:id w:val="2126106083"/>
+          <w14:checkbox>
+            <w14:checked w14:val="0"/>
+            <w14:checkedState w14:val="2612" w14:font="MS Gothic"/>
+            <w14:uncheckedState w14:val="2610" w14:font="MS Gothic"/>
+          </w14:checkbox>
+        </w:sdtPr>
+        <w:sdtContent>
+          <w:r>
+            <w:rPr>
+              <w:rFonts w:ascii="MS Gothic" w:eastAsia="MS Gothic" w:hAnsi="MS Gothic" w:cs="Calibri" w:hint="eastAsia"/>
+              <w:sz w:val="22"/>
+              <w:szCs w:val="22"/>
+            </w:rPr>
+            <w:t>☐</w:t>
+          </w:r>
+        </w:sdtContent>
+      </w:sdt>
+      <w:r>
+        <w:rPr>
+          <w:rFonts w:ascii="Calibri" w:hAnsi="Calibri" w:cs="Calibri"/>
+          <w:sz w:val="22"/>
+          <w:szCs w:val="22"/>
+        </w:rPr>
+        <w:t>  False</w:t>
       </w:r>
     </w:p>
     <w:p>
@@ -1824,61 +2980,136 @@
         <w:rPr>
           <w:rFonts w:ascii="Calibri" w:hAnsi="Calibri" w:cs="Calibri"/>
         </w:rPr>
-        <w:t>Checklist point: There are signs of possible abuse. Circle a, b or c.</w:t>
-      </w:r>
-    </w:p>
-    <w:p>
-      <w:pPr>
-        <w:pStyle w:val="opt"/>
-        <w:rPr>
-          <w:rFonts w:ascii="Calibri" w:hAnsi="Calibri" w:cs="Calibri"/>
-          <w:sz w:val="22"/>
-          <w:szCs w:val="22"/>
-        </w:rPr>
-      </w:pPr>
-      <w:r>
-        <w:rPr>
-          <w:rFonts w:ascii="Calibri" w:hAnsi="Calibri" w:cs="Calibri"/>
-          <w:sz w:val="22"/>
-          <w:szCs w:val="22"/>
-        </w:rPr>
-        <w:t>a) Ornaments are missing and parcels keep arriving for Donna.</w:t>
-      </w:r>
-    </w:p>
-    <w:p>
-      <w:pPr>
-        <w:pStyle w:val="opt"/>
-        <w:rPr>
-          <w:rFonts w:ascii="Calibri" w:hAnsi="Calibri" w:cs="Calibri"/>
-          <w:sz w:val="22"/>
-          <w:szCs w:val="22"/>
-        </w:rPr>
-      </w:pPr>
-      <w:r>
-        <w:rPr>
-          <w:rFonts w:ascii="Calibri" w:hAnsi="Calibri" w:cs="Calibri"/>
-          <w:sz w:val="22"/>
-          <w:szCs w:val="22"/>
-        </w:rPr>
-        <w:t>b) Cherry is crying.</w:t>
-      </w:r>
-    </w:p>
-    <w:p>
-      <w:pPr>
-        <w:pStyle w:val="opt"/>
-        <w:rPr>
-          <w:rFonts w:ascii="Calibri" w:hAnsi="Calibri" w:cs="Calibri"/>
-          <w:sz w:val="22"/>
-          <w:szCs w:val="22"/>
-        </w:rPr>
-      </w:pPr>
-      <w:r>
-        <w:rPr>
-          <w:rFonts w:ascii="Calibri" w:hAnsi="Calibri" w:cs="Calibri"/>
-          <w:sz w:val="22"/>
-          <w:szCs w:val="22"/>
-        </w:rPr>
-        <w:t>c) Cherry goes to church.</w:t>
+        <w:t>Checklist point: There are signs of possible abuse. Tick one box.</w:t>
+      </w:r>
+    </w:p>
+    <w:p>
+      <w:pPr>
+        <w:pStyle w:val="opt"/>
+        <w:rPr>
+          <w:rFonts w:ascii="Calibri" w:hAnsi="Calibri" w:cs="Calibri"/>
+          <w:sz w:val="22"/>
+          <w:szCs w:val="22"/>
+        </w:rPr>
+      </w:pPr>
+      <w:sdt>
+        <w:sdtPr>
+          <w:rPr>
+            <w:rFonts w:ascii="Calibri" w:hAnsi="Calibri" w:cs="Calibri"/>
+            <w:sz w:val="22"/>
+            <w:szCs w:val="22"/>
+          </w:rPr>
+          <w:id w:val="-1543204961"/>
+          <w14:checkbox>
+            <w14:checked w14:val="0"/>
+            <w14:checkedState w14:val="2612" w14:font="MS Gothic"/>
+            <w14:uncheckedState w14:val="2610" w14:font="MS Gothic"/>
+          </w14:checkbox>
+        </w:sdtPr>
+        <w:sdtContent>
+          <w:r>
+            <w:rPr>
+              <w:rFonts w:ascii="MS Gothic" w:eastAsia="MS Gothic" w:hAnsi="MS Gothic" w:cs="Calibri" w:hint="eastAsia"/>
+              <w:sz w:val="22"/>
+              <w:szCs w:val="22"/>
+            </w:rPr>
+            <w:t>☐</w:t>
+          </w:r>
+        </w:sdtContent>
+      </w:sdt>
+      <w:r>
+        <w:rPr>
+          <w:rFonts w:ascii="Calibri" w:hAnsi="Calibri" w:cs="Calibri"/>
+          <w:sz w:val="22"/>
+          <w:szCs w:val="22"/>
+        </w:rPr>
+        <w:t>  a) Ornaments are missing and parcels keep arriving for Donna.</w:t>
+      </w:r>
+    </w:p>
+    <w:p>
+      <w:pPr>
+        <w:pStyle w:val="opt"/>
+        <w:rPr>
+          <w:rFonts w:ascii="Calibri" w:hAnsi="Calibri" w:cs="Calibri"/>
+          <w:sz w:val="22"/>
+          <w:szCs w:val="22"/>
+        </w:rPr>
+      </w:pPr>
+      <w:sdt>
+        <w:sdtPr>
+          <w:rPr>
+            <w:rFonts w:ascii="Calibri" w:hAnsi="Calibri" w:cs="Calibri"/>
+            <w:sz w:val="22"/>
+            <w:szCs w:val="22"/>
+          </w:rPr>
+          <w:id w:val="796564000"/>
+          <w14:checkbox>
+            <w14:checked w14:val="0"/>
+            <w14:checkedState w14:val="2612" w14:font="MS Gothic"/>
+            <w14:uncheckedState w14:val="2610" w14:font="MS Gothic"/>
+          </w14:checkbox>
+        </w:sdtPr>
+        <w:sdtContent>
+          <w:r>
+            <w:rPr>
+              <w:rFonts w:ascii="MS Gothic" w:eastAsia="MS Gothic" w:hAnsi="MS Gothic" w:cs="Calibri" w:hint="eastAsia"/>
+              <w:sz w:val="22"/>
+              <w:szCs w:val="22"/>
+            </w:rPr>
+            <w:t>☐</w:t>
+          </w:r>
+        </w:sdtContent>
+      </w:sdt>
+      <w:r>
+        <w:rPr>
+          <w:rFonts w:ascii="Calibri" w:hAnsi="Calibri" w:cs="Calibri"/>
+          <w:sz w:val="22"/>
+          <w:szCs w:val="22"/>
+        </w:rPr>
+        <w:t>  b) Cherry is crying.</w:t>
+      </w:r>
+    </w:p>
+    <w:p>
+      <w:pPr>
+        <w:pStyle w:val="opt"/>
+        <w:rPr>
+          <w:rFonts w:ascii="Calibri" w:hAnsi="Calibri" w:cs="Calibri"/>
+          <w:sz w:val="22"/>
+          <w:szCs w:val="22"/>
+        </w:rPr>
+      </w:pPr>
+      <w:sdt>
+        <w:sdtPr>
+          <w:rPr>
+            <w:rFonts w:ascii="Calibri" w:hAnsi="Calibri" w:cs="Calibri"/>
+            <w:sz w:val="22"/>
+            <w:szCs w:val="22"/>
+          </w:rPr>
+          <w:id w:val="205537666"/>
+          <w14:checkbox>
+            <w14:checked w14:val="0"/>
+            <w14:checkedState w14:val="2612" w14:font="MS Gothic"/>
+            <w14:uncheckedState w14:val="2610" w14:font="MS Gothic"/>
+          </w14:checkbox>
+        </w:sdtPr>
+        <w:sdtContent>
+          <w:r>
+            <w:rPr>
+              <w:rFonts w:ascii="MS Gothic" w:eastAsia="MS Gothic" w:hAnsi="MS Gothic" w:cs="Calibri" w:hint="eastAsia"/>
+              <w:sz w:val="22"/>
+              <w:szCs w:val="22"/>
+            </w:rPr>
+            <w:t>☐</w:t>
+          </w:r>
+        </w:sdtContent>
+      </w:sdt>
+      <w:r>
+        <w:rPr>
+          <w:rFonts w:ascii="Calibri" w:hAnsi="Calibri" w:cs="Calibri"/>
+          <w:sz w:val="22"/>
+          <w:szCs w:val="22"/>
+        </w:rPr>
+        <w:t>  c) Cherry goes to church.</w:t>
       </w:r>
     </w:p>
     <w:p>
@@ -1960,25 +3191,83 @@
         <w:rPr>
           <w:rFonts w:ascii="Calibri" w:hAnsi="Calibri" w:cs="Calibri"/>
         </w:rPr>
-        <w:t>Checklist point: Show that Cherry is in charge of her own life. Circle True or False.</w:t>
-      </w:r>
-    </w:p>
-    <w:p>
-      <w:pPr>
-        <w:pStyle w:val="opt"/>
-        <w:rPr>
-          <w:rFonts w:ascii="Calibri" w:hAnsi="Calibri" w:cs="Calibri"/>
-          <w:sz w:val="22"/>
-          <w:szCs w:val="22"/>
-        </w:rPr>
-      </w:pPr>
-      <w:r>
-        <w:rPr>
-          <w:rFonts w:ascii="Calibri" w:hAnsi="Calibri" w:cs="Calibri"/>
-          <w:sz w:val="22"/>
-          <w:szCs w:val="22"/>
-        </w:rPr>
-        <w:t>True   /   False</w:t>
+        <w:t>Checklist point: Show that Cherry is in charge of her own life. Tick True or False.</w:t>
+      </w:r>
+    </w:p>
+    <w:p>
+      <w:pPr>
+        <w:pStyle w:val="opt"/>
+        <w:rPr>
+          <w:rFonts w:ascii="Calibri" w:hAnsi="Calibri" w:cs="Calibri"/>
+          <w:sz w:val="22"/>
+          <w:szCs w:val="22"/>
+        </w:rPr>
+      </w:pPr>
+      <w:sdt>
+        <w:sdtPr>
+          <w:rPr>
+            <w:rFonts w:ascii="Calibri" w:hAnsi="Calibri" w:cs="Calibri"/>
+            <w:sz w:val="22"/>
+            <w:szCs w:val="22"/>
+          </w:rPr>
+          <w:id w:val="-1707712171"/>
+          <w14:checkbox>
+            <w14:checked w14:val="0"/>
+            <w14:checkedState w14:val="2612" w14:font="MS Gothic"/>
+            <w14:uncheckedState w14:val="2610" w14:font="MS Gothic"/>
+          </w14:checkbox>
+        </w:sdtPr>
+        <w:sdtContent>
+          <w:r>
+            <w:rPr>
+              <w:rFonts w:ascii="MS Gothic" w:eastAsia="MS Gothic" w:hAnsi="MS Gothic" w:cs="Calibri" w:hint="eastAsia"/>
+              <w:sz w:val="22"/>
+              <w:szCs w:val="22"/>
+            </w:rPr>
+            <w:t>☐</w:t>
+          </w:r>
+        </w:sdtContent>
+      </w:sdt>
+      <w:r>
+        <w:rPr>
+          <w:rFonts w:ascii="Calibri" w:hAnsi="Calibri" w:cs="Calibri"/>
+          <w:sz w:val="22"/>
+          <w:szCs w:val="22"/>
+        </w:rPr>
+        <w:t>  True       </w:t>
+      </w:r>
+      <w:sdt>
+        <w:sdtPr>
+          <w:rPr>
+            <w:rFonts w:ascii="Calibri" w:hAnsi="Calibri" w:cs="Calibri"/>
+            <w:sz w:val="22"/>
+            <w:szCs w:val="22"/>
+          </w:rPr>
+          <w:id w:val="1734744149"/>
+          <w14:checkbox>
+            <w14:checked w14:val="0"/>
+            <w14:checkedState w14:val="2612" w14:font="MS Gothic"/>
+            <w14:uncheckedState w14:val="2610" w14:font="MS Gothic"/>
+          </w14:checkbox>
+        </w:sdtPr>
+        <w:sdtContent>
+          <w:r>
+            <w:rPr>
+              <w:rFonts w:ascii="MS Gothic" w:eastAsia="MS Gothic" w:hAnsi="MS Gothic" w:cs="Calibri" w:hint="eastAsia"/>
+              <w:sz w:val="22"/>
+              <w:szCs w:val="22"/>
+            </w:rPr>
+            <w:t>☐</w:t>
+          </w:r>
+        </w:sdtContent>
+      </w:sdt>
+      <w:r>
+        <w:rPr>
+          <w:rFonts w:ascii="Calibri" w:hAnsi="Calibri" w:cs="Calibri"/>
+          <w:sz w:val="22"/>
+          <w:szCs w:val="22"/>
+        </w:rPr>
+        <w:t>  False</w:t>
       </w:r>
     </w:p>
     <w:p>
@@ -2012,61 +3301,136 @@
         <w:rPr>
           <w:rFonts w:ascii="Calibri" w:hAnsi="Calibri" w:cs="Calibri"/>
         </w:rPr>
-        <w:t>Checklist point: Report the problems, risks and signs of abuse, following policy. Circle a, b or c.</w:t>
-      </w:r>
-    </w:p>
-    <w:p>
-      <w:pPr>
-        <w:pStyle w:val="opt"/>
-        <w:rPr>
-          <w:rFonts w:ascii="Calibri" w:hAnsi="Calibri" w:cs="Calibri"/>
-          <w:sz w:val="22"/>
-          <w:szCs w:val="22"/>
-        </w:rPr>
-      </w:pPr>
-      <w:r>
-        <w:rPr>
-          <w:rFonts w:ascii="Calibri" w:hAnsi="Calibri" w:cs="Calibri"/>
-          <w:sz w:val="22"/>
-          <w:szCs w:val="22"/>
-        </w:rPr>
-        <w:t>a) next week</w:t>
-      </w:r>
-    </w:p>
-    <w:p>
-      <w:pPr>
-        <w:pStyle w:val="opt"/>
-        <w:rPr>
-          <w:rFonts w:ascii="Calibri" w:hAnsi="Calibri" w:cs="Calibri"/>
-          <w:sz w:val="22"/>
-          <w:szCs w:val="22"/>
-        </w:rPr>
-      </w:pPr>
-      <w:r>
-        <w:rPr>
-          <w:rFonts w:ascii="Calibri" w:hAnsi="Calibri" w:cs="Calibri"/>
-          <w:sz w:val="22"/>
-          <w:szCs w:val="22"/>
-        </w:rPr>
-        <w:t>b) straight away</w:t>
-      </w:r>
-    </w:p>
-    <w:p>
-      <w:pPr>
-        <w:pStyle w:val="opt"/>
-        <w:rPr>
-          <w:rFonts w:ascii="Calibri" w:hAnsi="Calibri" w:cs="Calibri"/>
-          <w:sz w:val="22"/>
-          <w:szCs w:val="22"/>
-        </w:rPr>
-      </w:pPr>
-      <w:r>
-        <w:rPr>
-          <w:rFonts w:ascii="Calibri" w:hAnsi="Calibri" w:cs="Calibri"/>
-          <w:sz w:val="22"/>
-          <w:szCs w:val="22"/>
-        </w:rPr>
-        <w:t>c) only if Cherry agrees</w:t>
+        <w:t>Checklist point: Report the problems, risks and signs of abuse, following policy. Tick one box.</w:t>
+      </w:r>
+    </w:p>
+    <w:p>
+      <w:pPr>
+        <w:pStyle w:val="opt"/>
+        <w:rPr>
+          <w:rFonts w:ascii="Calibri" w:hAnsi="Calibri" w:cs="Calibri"/>
+          <w:sz w:val="22"/>
+          <w:szCs w:val="22"/>
+        </w:rPr>
+      </w:pPr>
+      <w:sdt>
+        <w:sdtPr>
+          <w:rPr>
+            <w:rFonts w:ascii="Calibri" w:hAnsi="Calibri" w:cs="Calibri"/>
+            <w:sz w:val="22"/>
+            <w:szCs w:val="22"/>
+          </w:rPr>
+          <w:id w:val="-2006573608"/>
+          <w14:checkbox>
+            <w14:checked w14:val="0"/>
+            <w14:checkedState w14:val="2612" w14:font="MS Gothic"/>
+            <w14:uncheckedState w14:val="2610" w14:font="MS Gothic"/>
+          </w14:checkbox>
+        </w:sdtPr>
+        <w:sdtContent>
+          <w:r>
+            <w:rPr>
+              <w:rFonts w:ascii="MS Gothic" w:eastAsia="MS Gothic" w:hAnsi="MS Gothic" w:cs="Calibri" w:hint="eastAsia"/>
+              <w:sz w:val="22"/>
+              <w:szCs w:val="22"/>
+            </w:rPr>
+            <w:t>☐</w:t>
+          </w:r>
+        </w:sdtContent>
+      </w:sdt>
+      <w:r>
+        <w:rPr>
+          <w:rFonts w:ascii="Calibri" w:hAnsi="Calibri" w:cs="Calibri"/>
+          <w:sz w:val="22"/>
+          <w:szCs w:val="22"/>
+        </w:rPr>
+        <w:t>  a) next week</w:t>
+      </w:r>
+    </w:p>
+    <w:p>
+      <w:pPr>
+        <w:pStyle w:val="opt"/>
+        <w:rPr>
+          <w:rFonts w:ascii="Calibri" w:hAnsi="Calibri" w:cs="Calibri"/>
+          <w:sz w:val="22"/>
+          <w:szCs w:val="22"/>
+        </w:rPr>
+      </w:pPr>
+      <w:sdt>
+        <w:sdtPr>
+          <w:rPr>
+            <w:rFonts w:ascii="Calibri" w:hAnsi="Calibri" w:cs="Calibri"/>
+            <w:sz w:val="22"/>
+            <w:szCs w:val="22"/>
+          </w:rPr>
+          <w:id w:val="-1035810600"/>
+          <w14:checkbox>
+            <w14:checked w14:val="0"/>
+            <w14:checkedState w14:val="2612" w14:font="MS Gothic"/>
+            <w14:uncheckedState w14:val="2610" w14:font="MS Gothic"/>
+          </w14:checkbox>
+        </w:sdtPr>
+        <w:sdtContent>
+          <w:r>
+            <w:rPr>
+              <w:rFonts w:ascii="MS Gothic" w:eastAsia="MS Gothic" w:hAnsi="MS Gothic" w:cs="Calibri" w:hint="eastAsia"/>
+              <w:sz w:val="22"/>
+              <w:szCs w:val="22"/>
+            </w:rPr>
+            <w:t>☐</w:t>
+          </w:r>
+        </w:sdtContent>
+      </w:sdt>
+      <w:r>
+        <w:rPr>
+          <w:rFonts w:ascii="Calibri" w:hAnsi="Calibri" w:cs="Calibri"/>
+          <w:sz w:val="22"/>
+          <w:szCs w:val="22"/>
+        </w:rPr>
+        <w:t>  b) straight away</w:t>
+      </w:r>
+    </w:p>
+    <w:p>
+      <w:pPr>
+        <w:pStyle w:val="opt"/>
+        <w:rPr>
+          <w:rFonts w:ascii="Calibri" w:hAnsi="Calibri" w:cs="Calibri"/>
+          <w:sz w:val="22"/>
+          <w:szCs w:val="22"/>
+        </w:rPr>
+      </w:pPr>
+      <w:sdt>
+        <w:sdtPr>
+          <w:rPr>
+            <w:rFonts w:ascii="Calibri" w:hAnsi="Calibri" w:cs="Calibri"/>
+            <w:sz w:val="22"/>
+            <w:szCs w:val="22"/>
+          </w:rPr>
+          <w:id w:val="1323690727"/>
+          <w14:checkbox>
+            <w14:checked w14:val="0"/>
+            <w14:checkedState w14:val="2612" w14:font="MS Gothic"/>
+            <w14:uncheckedState w14:val="2610" w14:font="MS Gothic"/>
+          </w14:checkbox>
+        </w:sdtPr>
+        <w:sdtContent>
+          <w:r>
+            <w:rPr>
+              <w:rFonts w:ascii="MS Gothic" w:eastAsia="MS Gothic" w:hAnsi="MS Gothic" w:cs="Calibri" w:hint="eastAsia"/>
+              <w:sz w:val="22"/>
+              <w:szCs w:val="22"/>
+            </w:rPr>
+            <w:t>☐</w:t>
+          </w:r>
+        </w:sdtContent>
+      </w:sdt>
+      <w:r>
+        <w:rPr>
+          <w:rFonts w:ascii="Calibri" w:hAnsi="Calibri" w:cs="Calibri"/>
+          <w:sz w:val="22"/>
+          <w:szCs w:val="22"/>
+        </w:rPr>
+        <w:t>  c) only if Cherry agrees</w:t>
       </w:r>
     </w:p>
     <w:p>
@@ -2211,69 +3575,136 @@
         <w:rPr>
           <w:rFonts w:ascii="Calibri" w:hAnsi="Calibri" w:cs="Calibri"/>
         </w:rPr>
-        <w:t>Checklist point: Write the progress note from the Word document. Circle a, b or c.</w:t>
-      </w:r>
-    </w:p>
-    <w:p>
-      <w:pPr>
-        <w:pStyle w:val="opt"/>
-        <w:rPr>
-          <w:rFonts w:ascii="Calibri" w:hAnsi="Calibri" w:cs="Calibri"/>
-          <w:sz w:val="22"/>
-          <w:szCs w:val="22"/>
-        </w:rPr>
-      </w:pPr>
-      <w:r>
-        <w:rPr>
-          <w:rFonts w:ascii="Calibri" w:hAnsi="Calibri" w:cs="Calibri"/>
-          <w:sz w:val="22"/>
-          <w:szCs w:val="22"/>
-        </w:rPr>
-        <w:t>a) Facts, Cherry'</w:t>
-      </w:r>
-      <w:r>
-        <w:rPr>
-          <w:rFonts w:ascii="Calibri" w:hAnsi="Calibri" w:cs="Calibri"/>
-          <w:sz w:val="22"/>
-          <w:szCs w:val="22"/>
-        </w:rPr>
-        <w:t>s own words, what you did and who you told.</w:t>
-      </w:r>
-    </w:p>
-    <w:p>
-      <w:pPr>
-        <w:pStyle w:val="opt"/>
-        <w:rPr>
-          <w:rFonts w:ascii="Calibri" w:hAnsi="Calibri" w:cs="Calibri"/>
-          <w:sz w:val="22"/>
-          <w:szCs w:val="22"/>
-        </w:rPr>
-      </w:pPr>
-      <w:r>
-        <w:rPr>
-          <w:rFonts w:ascii="Calibri" w:hAnsi="Calibri" w:cs="Calibri"/>
-          <w:sz w:val="22"/>
-          <w:szCs w:val="22"/>
-        </w:rPr>
-        <w:t>b) Your opinion of Donna.</w:t>
-      </w:r>
-    </w:p>
-    <w:p>
-      <w:pPr>
-        <w:pStyle w:val="opt"/>
-        <w:rPr>
-          <w:rFonts w:ascii="Calibri" w:hAnsi="Calibri" w:cs="Calibri"/>
-          <w:sz w:val="22"/>
-          <w:szCs w:val="22"/>
-        </w:rPr>
-      </w:pPr>
-      <w:r>
-        <w:rPr>
-          <w:rFonts w:ascii="Calibri" w:hAnsi="Calibri" w:cs="Calibri"/>
-          <w:sz w:val="22"/>
-          <w:szCs w:val="22"/>
-        </w:rPr>
-        <w:t>c) A guess about what will happen next.</w:t>
+        <w:t>Checklist point: Write the progress note from the Word document. Tick one box.</w:t>
+      </w:r>
+    </w:p>
+    <w:p>
+      <w:pPr>
+        <w:pStyle w:val="opt"/>
+        <w:rPr>
+          <w:rFonts w:ascii="Calibri" w:hAnsi="Calibri" w:cs="Calibri"/>
+          <w:sz w:val="22"/>
+          <w:szCs w:val="22"/>
+        </w:rPr>
+      </w:pPr>
+      <w:sdt>
+        <w:sdtPr>
+          <w:rPr>
+            <w:rFonts w:ascii="Calibri" w:hAnsi="Calibri" w:cs="Calibri"/>
+            <w:sz w:val="22"/>
+            <w:szCs w:val="22"/>
+          </w:rPr>
+          <w:id w:val="-2122749259"/>
+          <w14:checkbox>
+            <w14:checked w14:val="0"/>
+            <w14:checkedState w14:val="2612" w14:font="MS Gothic"/>
+            <w14:uncheckedState w14:val="2610" w14:font="MS Gothic"/>
+          </w14:checkbox>
+        </w:sdtPr>
+        <w:sdtContent>
+          <w:r>
+            <w:rPr>
+              <w:rFonts w:ascii="MS Gothic" w:eastAsia="MS Gothic" w:hAnsi="MS Gothic" w:cs="Calibri" w:hint="eastAsia"/>
+              <w:sz w:val="22"/>
+              <w:szCs w:val="22"/>
+            </w:rPr>
+            <w:t>☐</w:t>
+          </w:r>
+        </w:sdtContent>
+      </w:sdt>
+      <w:r>
+        <w:rPr>
+          <w:rFonts w:ascii="Calibri" w:hAnsi="Calibri" w:cs="Calibri"/>
+          <w:sz w:val="22"/>
+          <w:szCs w:val="22"/>
+        </w:rPr>
+        <w:t>  a) Facts, Cherry's own words, what you did and who you told.</w:t>
+      </w:r>
+    </w:p>
+    <w:p>
+      <w:pPr>
+        <w:pStyle w:val="opt"/>
+        <w:rPr>
+          <w:rFonts w:ascii="Calibri" w:hAnsi="Calibri" w:cs="Calibri"/>
+          <w:sz w:val="22"/>
+          <w:szCs w:val="22"/>
+        </w:rPr>
+      </w:pPr>
+      <w:sdt>
+        <w:sdtPr>
+          <w:rPr>
+            <w:rFonts w:ascii="Calibri" w:hAnsi="Calibri" w:cs="Calibri"/>
+            <w:sz w:val="22"/>
+            <w:szCs w:val="22"/>
+          </w:rPr>
+          <w:id w:val="1280373002"/>
+          <w14:checkbox>
+            <w14:checked w14:val="0"/>
+            <w14:checkedState w14:val="2612" w14:font="MS Gothic"/>
+            <w14:uncheckedState w14:val="2610" w14:font="MS Gothic"/>
+          </w14:checkbox>
+        </w:sdtPr>
+        <w:sdtContent>
+          <w:r>
+            <w:rPr>
+              <w:rFonts w:ascii="MS Gothic" w:eastAsia="MS Gothic" w:hAnsi="MS Gothic" w:cs="Calibri" w:hint="eastAsia"/>
+              <w:sz w:val="22"/>
+              <w:szCs w:val="22"/>
+            </w:rPr>
+            <w:t>☐</w:t>
+          </w:r>
+        </w:sdtContent>
+      </w:sdt>
+      <w:r>
+        <w:rPr>
+          <w:rFonts w:ascii="Calibri" w:hAnsi="Calibri" w:cs="Calibri"/>
+          <w:sz w:val="22"/>
+          <w:szCs w:val="22"/>
+        </w:rPr>
+        <w:t>  b) Your opinion of Donna.</w:t>
+      </w:r>
+    </w:p>
+    <w:p>
+      <w:pPr>
+        <w:pStyle w:val="opt"/>
+        <w:rPr>
+          <w:rFonts w:ascii="Calibri" w:hAnsi="Calibri" w:cs="Calibri"/>
+          <w:sz w:val="22"/>
+          <w:szCs w:val="22"/>
+        </w:rPr>
+      </w:pPr>
+      <w:sdt>
+        <w:sdtPr>
+          <w:rPr>
+            <w:rFonts w:ascii="Calibri" w:hAnsi="Calibri" w:cs="Calibri"/>
+            <w:sz w:val="22"/>
+            <w:szCs w:val="22"/>
+          </w:rPr>
+          <w:id w:val="-1290730075"/>
+          <w14:checkbox>
+            <w14:checked w14:val="0"/>
+            <w14:checkedState w14:val="2612" w14:font="MS Gothic"/>
+            <w14:uncheckedState w14:val="2610" w14:font="MS Gothic"/>
+          </w14:checkbox>
+        </w:sdtPr>
+        <w:sdtContent>
+          <w:r>
+            <w:rPr>
+              <w:rFonts w:ascii="MS Gothic" w:eastAsia="MS Gothic" w:hAnsi="MS Gothic" w:cs="Calibri" w:hint="eastAsia"/>
+              <w:sz w:val="22"/>
+              <w:szCs w:val="22"/>
+            </w:rPr>
+            <w:t>☐</w:t>
+          </w:r>
+        </w:sdtContent>
+      </w:sdt>
+      <w:r>
+        <w:rPr>
+          <w:rFonts w:ascii="Calibri" w:hAnsi="Calibri" w:cs="Calibri"/>
+          <w:sz w:val="22"/>
+          <w:szCs w:val="22"/>
+        </w:rPr>
+        <w:t>  c) A guess about what will happen next.</w:t>
       </w:r>
     </w:p>
     <w:p>

</xml_diff>